<commit_message>
TUAN01/ Hoan thanh bai tạp ML_01
</commit_message>
<xml_diff>
--- a/TUAN01/Lab01_LEDOHOATHUONG_3124411304.docx
+++ b/TUAN01/Lab01_LEDOHOATHUONG_3124411304.docx
@@ -653,6 +653,12 @@
     </w:p>
     <w:sdt>
       <w:sdtPr>
+        <w:rPr>
+          <w:rFonts w:ascii="Times New Roman" w:eastAsiaTheme="minorHAnsi" w:hAnsi="Times New Roman" w:cstheme="minorBidi"/>
+          <w:color w:val="000000" w:themeColor="text1"/>
+          <w:sz w:val="26"/>
+          <w:szCs w:val="22"/>
+        </w:rPr>
         <w:id w:val="1282619002"/>
         <w:docPartObj>
           <w:docPartGallery w:val="Table of Contents"/>
@@ -661,13 +667,9 @@
       </w:sdtPr>
       <w:sdtEndPr>
         <w:rPr>
-          <w:rFonts w:ascii="Times New Roman" w:eastAsiaTheme="minorHAnsi" w:hAnsi="Times New Roman" w:cstheme="minorBidi"/>
           <w:b/>
           <w:bCs/>
           <w:noProof/>
-          <w:color w:val="000000" w:themeColor="text1"/>
-          <w:sz w:val="26"/>
-          <w:szCs w:val="22"/>
         </w:rPr>
       </w:sdtEndPr>
       <w:sdtContent>
@@ -713,7 +715,7 @@
           <w:r>
             <w:fldChar w:fldCharType="separate"/>
           </w:r>
-          <w:hyperlink w:anchor="_Toc240112288" w:history="1">
+          <w:hyperlink w:anchor="_Toc240227065" w:history="1">
             <w:r>
               <w:rPr>
                 <w:rStyle w:val="Hyperlink"/>
@@ -741,7 +743,7 @@
                 <w:noProof/>
                 <w:webHidden/>
               </w:rPr>
-              <w:instrText xml:space="preserve"> PAGEREF _Toc240112288 \h </w:instrText>
+              <w:instrText xml:space="preserve"> PAGEREF _Toc240227065 \h </w:instrText>
             </w:r>
             <w:r>
               <w:rPr>
@@ -761,7 +763,7 @@
                 <w:noProof/>
                 <w:webHidden/>
               </w:rPr>
-              <w:t>5</w:t>
+              <w:t>4</w:t>
             </w:r>
             <w:r>
               <w:rPr>
@@ -785,7 +787,7 @@
               <w:sz w:val="22"/>
             </w:rPr>
           </w:pPr>
-          <w:hyperlink w:anchor="_Toc240112289" w:history="1">
+          <w:hyperlink w:anchor="_Toc240227066" w:history="1">
             <w:r>
               <w:rPr>
                 <w:rStyle w:val="Hyperlink"/>
@@ -812,7 +814,7 @@
                 <w:noProof/>
                 <w:webHidden/>
               </w:rPr>
-              <w:instrText xml:space="preserve"> PAGEREF _Toc240112289 \h </w:instrText>
+              <w:instrText xml:space="preserve"> PAGEREF _Toc240227066 \h </w:instrText>
             </w:r>
             <w:r>
               <w:rPr>
@@ -832,7 +834,7 @@
                 <w:noProof/>
                 <w:webHidden/>
               </w:rPr>
-              <w:t>5</w:t>
+              <w:t>4</w:t>
             </w:r>
             <w:r>
               <w:rPr>
@@ -857,7 +859,7 @@
               <w:sz w:val="22"/>
             </w:rPr>
           </w:pPr>
-          <w:hyperlink w:anchor="_Toc240112290" w:history="1">
+          <w:hyperlink w:anchor="_Toc240227067" w:history="1">
             <w:r>
               <w:rPr>
                 <w:rStyle w:val="Hyperlink"/>
@@ -902,7 +904,7 @@
                 <w:noProof/>
                 <w:webHidden/>
               </w:rPr>
-              <w:instrText xml:space="preserve"> PAGEREF _Toc240112290 \h </w:instrText>
+              <w:instrText xml:space="preserve"> PAGEREF _Toc240227067 \h </w:instrText>
             </w:r>
             <w:r>
               <w:rPr>
@@ -922,7 +924,7 @@
                 <w:noProof/>
                 <w:webHidden/>
               </w:rPr>
-              <w:t>5</w:t>
+              <w:t>4</w:t>
             </w:r>
             <w:r>
               <w:rPr>
@@ -946,7 +948,7 @@
               <w:sz w:val="22"/>
             </w:rPr>
           </w:pPr>
-          <w:hyperlink w:anchor="_Toc240112291" w:history="1">
+          <w:hyperlink w:anchor="_Toc240227068" w:history="1">
             <w:r>
               <w:rPr>
                 <w:rStyle w:val="Hyperlink"/>
@@ -974,7 +976,7 @@
                 <w:noProof/>
                 <w:webHidden/>
               </w:rPr>
-              <w:instrText xml:space="preserve"> PAGEREF _Toc240112291 \h </w:instrText>
+              <w:instrText xml:space="preserve"> PAGEREF _Toc240227068 \h </w:instrText>
             </w:r>
             <w:r>
               <w:rPr>
@@ -994,7 +996,7 @@
                 <w:noProof/>
                 <w:webHidden/>
               </w:rPr>
-              <w:t>5</w:t>
+              <w:t>4</w:t>
             </w:r>
             <w:r>
               <w:rPr>
@@ -1018,7 +1020,7 @@
               <w:sz w:val="22"/>
             </w:rPr>
           </w:pPr>
-          <w:hyperlink w:anchor="_Toc240112292" w:history="1">
+          <w:hyperlink w:anchor="_Toc240227069" w:history="1">
             <w:r>
               <w:rPr>
                 <w:rStyle w:val="Hyperlink"/>
@@ -1046,7 +1048,7 @@
                 <w:noProof/>
                 <w:webHidden/>
               </w:rPr>
-              <w:instrText xml:space="preserve"> PAGEREF _Toc240112292 \h </w:instrText>
+              <w:instrText xml:space="preserve"> PAGEREF _Toc240227069 \h </w:instrText>
             </w:r>
             <w:r>
               <w:rPr>
@@ -1066,7 +1068,7 @@
                 <w:noProof/>
                 <w:webHidden/>
               </w:rPr>
-              <w:t>5</w:t>
+              <w:t>4</w:t>
             </w:r>
             <w:r>
               <w:rPr>
@@ -1090,7 +1092,7 @@
               <w:sz w:val="22"/>
             </w:rPr>
           </w:pPr>
-          <w:hyperlink w:anchor="_Toc240112293" w:history="1">
+          <w:hyperlink w:anchor="_Toc240227070" w:history="1">
             <w:r>
               <w:rPr>
                 <w:rStyle w:val="Hyperlink"/>
@@ -1118,7 +1120,7 @@
                 <w:noProof/>
                 <w:webHidden/>
               </w:rPr>
-              <w:instrText xml:space="preserve"> PAGEREF _Toc240112293 \h </w:instrText>
+              <w:instrText xml:space="preserve"> PAGEREF _Toc240227070 \h </w:instrText>
             </w:r>
             <w:r>
               <w:rPr>
@@ -1138,7 +1140,7 @@
                 <w:noProof/>
                 <w:webHidden/>
               </w:rPr>
-              <w:t>6</w:t>
+              <w:t>5</w:t>
             </w:r>
             <w:r>
               <w:rPr>
@@ -1162,7 +1164,7 @@
               <w:sz w:val="22"/>
             </w:rPr>
           </w:pPr>
-          <w:hyperlink w:anchor="_Toc240112294" w:history="1">
+          <w:hyperlink w:anchor="_Toc240227071" w:history="1">
             <w:r>
               <w:rPr>
                 <w:rStyle w:val="Hyperlink"/>
@@ -1190,7 +1192,7 @@
                 <w:noProof/>
                 <w:webHidden/>
               </w:rPr>
-              <w:instrText xml:space="preserve"> PAGEREF _Toc240112294 \h </w:instrText>
+              <w:instrText xml:space="preserve"> PAGEREF _Toc240227071 \h </w:instrText>
             </w:r>
             <w:r>
               <w:rPr>
@@ -1210,7 +1212,7 @@
                 <w:noProof/>
                 <w:webHidden/>
               </w:rPr>
-              <w:t>6</w:t>
+              <w:t>5</w:t>
             </w:r>
             <w:r>
               <w:rPr>
@@ -1234,7 +1236,7 @@
               <w:sz w:val="22"/>
             </w:rPr>
           </w:pPr>
-          <w:hyperlink w:anchor="_Toc240112295" w:history="1">
+          <w:hyperlink w:anchor="_Toc240227072" w:history="1">
             <w:r>
               <w:rPr>
                 <w:rStyle w:val="Hyperlink"/>
@@ -1262,7 +1264,7 @@
                 <w:noProof/>
                 <w:webHidden/>
               </w:rPr>
-              <w:instrText xml:space="preserve"> PAGEREF _Toc240112295 \h </w:instrText>
+              <w:instrText xml:space="preserve"> PAGEREF _Toc240227072 \h </w:instrText>
             </w:r>
             <w:r>
               <w:rPr>
@@ -1282,7 +1284,7 @@
                 <w:noProof/>
                 <w:webHidden/>
               </w:rPr>
-              <w:t>6</w:t>
+              <w:t>5</w:t>
             </w:r>
             <w:r>
               <w:rPr>
@@ -1306,7 +1308,7 @@
               <w:sz w:val="22"/>
             </w:rPr>
           </w:pPr>
-          <w:hyperlink w:anchor="_Toc240112296" w:history="1">
+          <w:hyperlink w:anchor="_Toc240227073" w:history="1">
             <w:r>
               <w:rPr>
                 <w:rStyle w:val="Hyperlink"/>
@@ -1334,7 +1336,7 @@
                 <w:noProof/>
                 <w:webHidden/>
               </w:rPr>
-              <w:instrText xml:space="preserve"> PAGEREF _Toc240112296 \h </w:instrText>
+              <w:instrText xml:space="preserve"> PAGEREF _Toc240227073 \h </w:instrText>
             </w:r>
             <w:r>
               <w:rPr>
@@ -1354,7 +1356,7 @@
                 <w:noProof/>
                 <w:webHidden/>
               </w:rPr>
-              <w:t>7</w:t>
+              <w:t>5</w:t>
             </w:r>
             <w:r>
               <w:rPr>
@@ -1378,7 +1380,7 @@
               <w:sz w:val="22"/>
             </w:rPr>
           </w:pPr>
-          <w:hyperlink w:anchor="_Toc240112297" w:history="1">
+          <w:hyperlink w:anchor="_Toc240227074" w:history="1">
             <w:r>
               <w:rPr>
                 <w:rStyle w:val="Hyperlink"/>
@@ -1406,7 +1408,7 @@
                 <w:noProof/>
                 <w:webHidden/>
               </w:rPr>
-              <w:instrText xml:space="preserve"> PAGEREF _Toc240112297 \h </w:instrText>
+              <w:instrText xml:space="preserve"> PAGEREF _Toc240227074 \h </w:instrText>
             </w:r>
             <w:r>
               <w:rPr>
@@ -1426,7 +1428,7 @@
                 <w:noProof/>
                 <w:webHidden/>
               </w:rPr>
-              <w:t>7</w:t>
+              <w:t>6</w:t>
             </w:r>
             <w:r>
               <w:rPr>
@@ -1450,7 +1452,7 @@
               <w:sz w:val="22"/>
             </w:rPr>
           </w:pPr>
-          <w:hyperlink w:anchor="_Toc240112298" w:history="1">
+          <w:hyperlink w:anchor="_Toc240227075" w:history="1">
             <w:r>
               <w:rPr>
                 <w:rStyle w:val="Hyperlink"/>
@@ -1478,7 +1480,7 @@
                 <w:noProof/>
                 <w:webHidden/>
               </w:rPr>
-              <w:instrText xml:space="preserve"> PAGEREF _Toc240112298 \h </w:instrText>
+              <w:instrText xml:space="preserve"> PAGEREF _Toc240227075 \h </w:instrText>
             </w:r>
             <w:r>
               <w:rPr>
@@ -1498,7 +1500,7 @@
                 <w:noProof/>
                 <w:webHidden/>
               </w:rPr>
-              <w:t>7</w:t>
+              <w:t>6</w:t>
             </w:r>
             <w:r>
               <w:rPr>
@@ -1522,7 +1524,7 @@
               <w:sz w:val="22"/>
             </w:rPr>
           </w:pPr>
-          <w:hyperlink w:anchor="_Toc240112299" w:history="1">
+          <w:hyperlink w:anchor="_Toc240227076" w:history="1">
             <w:r>
               <w:rPr>
                 <w:rStyle w:val="Hyperlink"/>
@@ -1550,7 +1552,7 @@
                 <w:noProof/>
                 <w:webHidden/>
               </w:rPr>
-              <w:instrText xml:space="preserve"> PAGEREF _Toc240112299 \h </w:instrText>
+              <w:instrText xml:space="preserve"> PAGEREF _Toc240227076 \h </w:instrText>
             </w:r>
             <w:r>
               <w:rPr>
@@ -1570,7 +1572,7 @@
                 <w:noProof/>
                 <w:webHidden/>
               </w:rPr>
-              <w:t>7</w:t>
+              <w:t>6</w:t>
             </w:r>
             <w:r>
               <w:rPr>
@@ -1594,7 +1596,7 @@
               <w:sz w:val="22"/>
             </w:rPr>
           </w:pPr>
-          <w:hyperlink w:anchor="_Toc240112300" w:history="1">
+          <w:hyperlink w:anchor="_Toc240227077" w:history="1">
             <w:r>
               <w:rPr>
                 <w:rStyle w:val="Hyperlink"/>
@@ -1622,7 +1624,7 @@
                 <w:noProof/>
                 <w:webHidden/>
               </w:rPr>
-              <w:instrText xml:space="preserve"> PAGEREF _Toc240112300 \h </w:instrText>
+              <w:instrText xml:space="preserve"> PAGEREF _Toc240227077 \h </w:instrText>
             </w:r>
             <w:r>
               <w:rPr>
@@ -1642,7 +1644,7 @@
                 <w:noProof/>
                 <w:webHidden/>
               </w:rPr>
-              <w:t>8</w:t>
+              <w:t>6</w:t>
             </w:r>
             <w:r>
               <w:rPr>
@@ -1666,7 +1668,7 @@
               <w:sz w:val="22"/>
             </w:rPr>
           </w:pPr>
-          <w:hyperlink w:anchor="_Toc240112301" w:history="1">
+          <w:hyperlink w:anchor="_Toc240227078" w:history="1">
             <w:r>
               <w:rPr>
                 <w:rStyle w:val="Hyperlink"/>
@@ -1694,7 +1696,7 @@
                 <w:noProof/>
                 <w:webHidden/>
               </w:rPr>
-              <w:instrText xml:space="preserve"> PAGEREF _Toc240112301 \h </w:instrText>
+              <w:instrText xml:space="preserve"> PAGEREF _Toc240227078 \h </w:instrText>
             </w:r>
             <w:r>
               <w:rPr>
@@ -1714,7 +1716,7 @@
                 <w:noProof/>
                 <w:webHidden/>
               </w:rPr>
-              <w:t>8</w:t>
+              <w:t>6</w:t>
             </w:r>
             <w:r>
               <w:rPr>
@@ -1738,7 +1740,7 @@
               <w:sz w:val="22"/>
             </w:rPr>
           </w:pPr>
-          <w:hyperlink w:anchor="_Toc240112302" w:history="1">
+          <w:hyperlink w:anchor="_Toc240227079" w:history="1">
             <w:r>
               <w:rPr>
                 <w:rStyle w:val="Hyperlink"/>
@@ -1766,7 +1768,7 @@
                 <w:noProof/>
                 <w:webHidden/>
               </w:rPr>
-              <w:instrText xml:space="preserve"> PAGEREF _Toc240112302 \h </w:instrText>
+              <w:instrText xml:space="preserve"> PAGEREF _Toc240227079 \h </w:instrText>
             </w:r>
             <w:r>
               <w:rPr>
@@ -1786,7 +1788,7 @@
                 <w:noProof/>
                 <w:webHidden/>
               </w:rPr>
-              <w:t>8</w:t>
+              <w:t>7</w:t>
             </w:r>
             <w:r>
               <w:rPr>
@@ -1810,7 +1812,7 @@
               <w:sz w:val="22"/>
             </w:rPr>
           </w:pPr>
-          <w:hyperlink w:anchor="_Toc240112303" w:history="1">
+          <w:hyperlink w:anchor="_Toc240227080" w:history="1">
             <w:r>
               <w:rPr>
                 <w:rStyle w:val="Hyperlink"/>
@@ -1838,7 +1840,7 @@
                 <w:noProof/>
                 <w:webHidden/>
               </w:rPr>
-              <w:instrText xml:space="preserve"> PAGEREF _Toc240112303 \h </w:instrText>
+              <w:instrText xml:space="preserve"> PAGEREF _Toc240227080 \h </w:instrText>
             </w:r>
             <w:r>
               <w:rPr>
@@ -1858,7 +1860,7 @@
                 <w:noProof/>
                 <w:webHidden/>
               </w:rPr>
-              <w:t>9</w:t>
+              <w:t>7</w:t>
             </w:r>
             <w:r>
               <w:rPr>
@@ -1882,7 +1884,7 @@
               <w:sz w:val="22"/>
             </w:rPr>
           </w:pPr>
-          <w:hyperlink w:anchor="_Toc240112304" w:history="1">
+          <w:hyperlink w:anchor="_Toc240227081" w:history="1">
             <w:r>
               <w:rPr>
                 <w:rStyle w:val="Hyperlink"/>
@@ -1910,7 +1912,7 @@
                 <w:noProof/>
                 <w:webHidden/>
               </w:rPr>
-              <w:instrText xml:space="preserve"> PAGEREF _Toc240112304 \h </w:instrText>
+              <w:instrText xml:space="preserve"> PAGEREF _Toc240227081 \h </w:instrText>
             </w:r>
             <w:r>
               <w:rPr>
@@ -1930,7 +1932,7 @@
                 <w:noProof/>
                 <w:webHidden/>
               </w:rPr>
-              <w:t>9</w:t>
+              <w:t>7</w:t>
             </w:r>
             <w:r>
               <w:rPr>
@@ -1954,7 +1956,7 @@
               <w:sz w:val="22"/>
             </w:rPr>
           </w:pPr>
-          <w:hyperlink w:anchor="_Toc240112305" w:history="1">
+          <w:hyperlink w:anchor="_Toc240227082" w:history="1">
             <w:r>
               <w:rPr>
                 <w:rStyle w:val="Hyperlink"/>
@@ -1982,7 +1984,7 @@
                 <w:noProof/>
                 <w:webHidden/>
               </w:rPr>
-              <w:instrText xml:space="preserve"> PAGEREF _Toc240112305 \h </w:instrText>
+              <w:instrText xml:space="preserve"> PAGEREF _Toc240227082 \h </w:instrText>
             </w:r>
             <w:r>
               <w:rPr>
@@ -2002,7 +2004,7 @@
                 <w:noProof/>
                 <w:webHidden/>
               </w:rPr>
-              <w:t>9</w:t>
+              <w:t>7</w:t>
             </w:r>
             <w:r>
               <w:rPr>
@@ -2026,7 +2028,7 @@
               <w:sz w:val="22"/>
             </w:rPr>
           </w:pPr>
-          <w:hyperlink w:anchor="_Toc240112306" w:history="1">
+          <w:hyperlink w:anchor="_Toc240227083" w:history="1">
             <w:r>
               <w:rPr>
                 <w:rStyle w:val="Hyperlink"/>
@@ -2054,7 +2056,7 @@
                 <w:noProof/>
                 <w:webHidden/>
               </w:rPr>
-              <w:instrText xml:space="preserve"> PAGEREF _Toc240112306 \h </w:instrText>
+              <w:instrText xml:space="preserve"> PAGEREF _Toc240227083 \h </w:instrText>
             </w:r>
             <w:r>
               <w:rPr>
@@ -2074,7 +2076,7 @@
                 <w:noProof/>
                 <w:webHidden/>
               </w:rPr>
-              <w:t>10</w:t>
+              <w:t>8</w:t>
             </w:r>
             <w:r>
               <w:rPr>
@@ -2098,7 +2100,7 @@
               <w:sz w:val="22"/>
             </w:rPr>
           </w:pPr>
-          <w:hyperlink w:anchor="_Toc240112307" w:history="1">
+          <w:hyperlink w:anchor="_Toc240227084" w:history="1">
             <w:r>
               <w:rPr>
                 <w:rStyle w:val="Hyperlink"/>
@@ -2126,7 +2128,7 @@
                 <w:noProof/>
                 <w:webHidden/>
               </w:rPr>
-              <w:instrText xml:space="preserve"> PAGEREF _Toc240112307 \h </w:instrText>
+              <w:instrText xml:space="preserve"> PAGEREF _Toc240227084 \h </w:instrText>
             </w:r>
             <w:r>
               <w:rPr>
@@ -2146,7 +2148,7 @@
                 <w:noProof/>
                 <w:webHidden/>
               </w:rPr>
-              <w:t>10</w:t>
+              <w:t>9</w:t>
             </w:r>
             <w:r>
               <w:rPr>
@@ -2170,7 +2172,7 @@
               <w:sz w:val="22"/>
             </w:rPr>
           </w:pPr>
-          <w:hyperlink w:anchor="_Toc240112308" w:history="1">
+          <w:hyperlink w:anchor="_Toc240227085" w:history="1">
             <w:r>
               <w:rPr>
                 <w:rStyle w:val="Hyperlink"/>
@@ -2198,7 +2200,7 @@
                 <w:noProof/>
                 <w:webHidden/>
               </w:rPr>
-              <w:instrText xml:space="preserve"> PAGEREF _Toc240112308 \h </w:instrText>
+              <w:instrText xml:space="preserve"> PAGEREF _Toc240227085 \h </w:instrText>
             </w:r>
             <w:r>
               <w:rPr>
@@ -2218,7 +2220,7 @@
                 <w:noProof/>
                 <w:webHidden/>
               </w:rPr>
-              <w:t>11</w:t>
+              <w:t>9</w:t>
             </w:r>
             <w:r>
               <w:rPr>
@@ -2242,7 +2244,7 @@
               <w:sz w:val="22"/>
             </w:rPr>
           </w:pPr>
-          <w:hyperlink w:anchor="_Toc240112309" w:history="1">
+          <w:hyperlink w:anchor="_Toc240227086" w:history="1">
             <w:r>
               <w:rPr>
                 <w:rStyle w:val="Hyperlink"/>
@@ -2270,7 +2272,7 @@
                 <w:noProof/>
                 <w:webHidden/>
               </w:rPr>
-              <w:instrText xml:space="preserve"> PAGEREF _Toc240112309 \h </w:instrText>
+              <w:instrText xml:space="preserve"> PAGEREF _Toc240227086 \h </w:instrText>
             </w:r>
             <w:r>
               <w:rPr>
@@ -2290,7 +2292,7 @@
                 <w:noProof/>
                 <w:webHidden/>
               </w:rPr>
-              <w:t>11</w:t>
+              <w:t>9</w:t>
             </w:r>
             <w:r>
               <w:rPr>
@@ -2314,7 +2316,7 @@
               <w:sz w:val="22"/>
             </w:rPr>
           </w:pPr>
-          <w:hyperlink w:anchor="_Toc240112310" w:history="1">
+          <w:hyperlink w:anchor="_Toc240227087" w:history="1">
             <w:r>
               <w:rPr>
                 <w:rStyle w:val="Hyperlink"/>
@@ -2342,7 +2344,7 @@
                 <w:noProof/>
                 <w:webHidden/>
               </w:rPr>
-              <w:instrText xml:space="preserve"> PAGEREF _Toc240112310 \h </w:instrText>
+              <w:instrText xml:space="preserve"> PAGEREF _Toc240227087 \h </w:instrText>
             </w:r>
             <w:r>
               <w:rPr>
@@ -2362,7 +2364,7 @@
                 <w:noProof/>
                 <w:webHidden/>
               </w:rPr>
-              <w:t>11</w:t>
+              <w:t>10</w:t>
             </w:r>
             <w:r>
               <w:rPr>
@@ -2386,7 +2388,7 @@
               <w:sz w:val="22"/>
             </w:rPr>
           </w:pPr>
-          <w:hyperlink w:anchor="_Toc240112311" w:history="1">
+          <w:hyperlink w:anchor="_Toc240227088" w:history="1">
             <w:r>
               <w:rPr>
                 <w:rStyle w:val="Hyperlink"/>
@@ -2413,7 +2415,7 @@
                 <w:noProof/>
                 <w:webHidden/>
               </w:rPr>
-              <w:instrText xml:space="preserve"> PAGEREF _Toc240112311 \h </w:instrText>
+              <w:instrText xml:space="preserve"> PAGEREF _Toc240227088 \h </w:instrText>
             </w:r>
             <w:r>
               <w:rPr>
@@ -2433,7 +2435,7 @@
                 <w:noProof/>
                 <w:webHidden/>
               </w:rPr>
-              <w:t>12</w:t>
+              <w:t>11</w:t>
             </w:r>
             <w:r>
               <w:rPr>
@@ -2457,7 +2459,7 @@
               <w:sz w:val="22"/>
             </w:rPr>
           </w:pPr>
-          <w:hyperlink w:anchor="_Toc240112312" w:history="1">
+          <w:hyperlink w:anchor="_Toc240227089" w:history="1">
             <w:r>
               <w:rPr>
                 <w:rStyle w:val="Hyperlink"/>
@@ -2485,7 +2487,7 @@
                 <w:noProof/>
                 <w:webHidden/>
               </w:rPr>
-              <w:instrText xml:space="preserve"> PAGEREF _Toc240112312 \h </w:instrText>
+              <w:instrText xml:space="preserve"> PAGEREF _Toc240227089 \h </w:instrText>
             </w:r>
             <w:r>
               <w:rPr>
@@ -2505,7 +2507,7 @@
                 <w:noProof/>
                 <w:webHidden/>
               </w:rPr>
-              <w:t>12</w:t>
+              <w:t>11</w:t>
             </w:r>
             <w:r>
               <w:rPr>
@@ -2529,7 +2531,7 @@
               <w:sz w:val="22"/>
             </w:rPr>
           </w:pPr>
-          <w:hyperlink w:anchor="_Toc240112313" w:history="1">
+          <w:hyperlink w:anchor="_Toc240227090" w:history="1">
             <w:r>
               <w:rPr>
                 <w:rStyle w:val="Hyperlink"/>
@@ -2557,7 +2559,7 @@
                 <w:noProof/>
                 <w:webHidden/>
               </w:rPr>
-              <w:instrText xml:space="preserve"> PAGEREF _Toc240112313 \h </w:instrText>
+              <w:instrText xml:space="preserve"> PAGEREF _Toc240227090 \h </w:instrText>
             </w:r>
             <w:r>
               <w:rPr>
@@ -2577,7 +2579,7 @@
                 <w:noProof/>
                 <w:webHidden/>
               </w:rPr>
-              <w:t>12</w:t>
+              <w:t>11</w:t>
             </w:r>
             <w:r>
               <w:rPr>
@@ -2601,7 +2603,7 @@
               <w:sz w:val="22"/>
             </w:rPr>
           </w:pPr>
-          <w:hyperlink w:anchor="_Toc240112314" w:history="1">
+          <w:hyperlink w:anchor="_Toc240227091" w:history="1">
             <w:r>
               <w:rPr>
                 <w:rStyle w:val="Hyperlink"/>
@@ -2629,7 +2631,7 @@
                 <w:noProof/>
                 <w:webHidden/>
               </w:rPr>
-              <w:instrText xml:space="preserve"> PAGEREF _Toc240112314 \h </w:instrText>
+              <w:instrText xml:space="preserve"> PAGEREF _Toc240227091 \h </w:instrText>
             </w:r>
             <w:r>
               <w:rPr>
@@ -2649,7 +2651,7 @@
                 <w:noProof/>
                 <w:webHidden/>
               </w:rPr>
-              <w:t>12</w:t>
+              <w:t>11</w:t>
             </w:r>
             <w:r>
               <w:rPr>
@@ -2673,7 +2675,7 @@
               <w:sz w:val="22"/>
             </w:rPr>
           </w:pPr>
-          <w:hyperlink w:anchor="_Toc240112315" w:history="1">
+          <w:hyperlink w:anchor="_Toc240227092" w:history="1">
             <w:r>
               <w:rPr>
                 <w:rStyle w:val="Hyperlink"/>
@@ -2701,7 +2703,7 @@
                 <w:noProof/>
                 <w:webHidden/>
               </w:rPr>
-              <w:instrText xml:space="preserve"> PAGEREF _Toc240112315 \h </w:instrText>
+              <w:instrText xml:space="preserve"> PAGEREF _Toc240227092 \h </w:instrText>
             </w:r>
             <w:r>
               <w:rPr>
@@ -2721,7 +2723,7 @@
                 <w:noProof/>
                 <w:webHidden/>
               </w:rPr>
-              <w:t>13</w:t>
+              <w:t>12</w:t>
             </w:r>
             <w:r>
               <w:rPr>
@@ -2745,7 +2747,7 @@
               <w:sz w:val="22"/>
             </w:rPr>
           </w:pPr>
-          <w:hyperlink w:anchor="_Toc240112316" w:history="1">
+          <w:hyperlink w:anchor="_Toc240227093" w:history="1">
             <w:r>
               <w:rPr>
                 <w:rStyle w:val="Hyperlink"/>
@@ -2773,7 +2775,7 @@
                 <w:noProof/>
                 <w:webHidden/>
               </w:rPr>
-              <w:instrText xml:space="preserve"> PAGEREF _Toc240112316 \h </w:instrText>
+              <w:instrText xml:space="preserve"> PAGEREF _Toc240227093 \h </w:instrText>
             </w:r>
             <w:r>
               <w:rPr>
@@ -2793,7 +2795,7 @@
                 <w:noProof/>
                 <w:webHidden/>
               </w:rPr>
-              <w:t>14</w:t>
+              <w:t>13</w:t>
             </w:r>
             <w:r>
               <w:rPr>
@@ -2817,7 +2819,7 @@
               <w:sz w:val="22"/>
             </w:rPr>
           </w:pPr>
-          <w:hyperlink w:anchor="_Toc240112317" w:history="1">
+          <w:hyperlink w:anchor="_Toc240227094" w:history="1">
             <w:r>
               <w:rPr>
                 <w:rStyle w:val="Hyperlink"/>
@@ -2845,7 +2847,7 @@
                 <w:noProof/>
                 <w:webHidden/>
               </w:rPr>
-              <w:instrText xml:space="preserve"> PAGEREF _Toc240112317 \h </w:instrText>
+              <w:instrText xml:space="preserve"> PAGEREF _Toc240227094 \h </w:instrText>
             </w:r>
             <w:r>
               <w:rPr>
@@ -2865,7 +2867,7 @@
                 <w:noProof/>
                 <w:webHidden/>
               </w:rPr>
-              <w:t>14</w:t>
+              <w:t>13</w:t>
             </w:r>
             <w:r>
               <w:rPr>
@@ -2889,7 +2891,7 @@
               <w:sz w:val="22"/>
             </w:rPr>
           </w:pPr>
-          <w:hyperlink w:anchor="_Toc240112318" w:history="1">
+          <w:hyperlink w:anchor="_Toc240227095" w:history="1">
             <w:r>
               <w:rPr>
                 <w:rStyle w:val="Hyperlink"/>
@@ -2917,7 +2919,7 @@
                 <w:noProof/>
                 <w:webHidden/>
               </w:rPr>
-              <w:instrText xml:space="preserve"> PAGEREF _Toc240112318 \h </w:instrText>
+              <w:instrText xml:space="preserve"> PAGEREF _Toc240227095 \h </w:instrText>
             </w:r>
             <w:r>
               <w:rPr>
@@ -2937,7 +2939,7 @@
                 <w:noProof/>
                 <w:webHidden/>
               </w:rPr>
-              <w:t>14</w:t>
+              <w:t>13</w:t>
             </w:r>
             <w:r>
               <w:rPr>
@@ -2961,7 +2963,7 @@
               <w:sz w:val="22"/>
             </w:rPr>
           </w:pPr>
-          <w:hyperlink w:anchor="_Toc240112319" w:history="1">
+          <w:hyperlink w:anchor="_Toc240227096" w:history="1">
             <w:r>
               <w:rPr>
                 <w:rStyle w:val="Hyperlink"/>
@@ -2989,7 +2991,7 @@
                 <w:noProof/>
                 <w:webHidden/>
               </w:rPr>
-              <w:instrText xml:space="preserve"> PAGEREF _Toc240112319 \h </w:instrText>
+              <w:instrText xml:space="preserve"> PAGEREF _Toc240227096 \h </w:instrText>
             </w:r>
             <w:r>
               <w:rPr>
@@ -3009,7 +3011,7 @@
                 <w:noProof/>
                 <w:webHidden/>
               </w:rPr>
-              <w:t>14</w:t>
+              <w:t>13</w:t>
             </w:r>
             <w:r>
               <w:rPr>
@@ -3033,7 +3035,7 @@
               <w:sz w:val="22"/>
             </w:rPr>
           </w:pPr>
-          <w:hyperlink w:anchor="_Toc240112320" w:history="1">
+          <w:hyperlink w:anchor="_Toc240227097" w:history="1">
             <w:r>
               <w:rPr>
                 <w:rStyle w:val="Hyperlink"/>
@@ -3061,7 +3063,7 @@
                 <w:noProof/>
                 <w:webHidden/>
               </w:rPr>
-              <w:instrText xml:space="preserve"> PAGEREF _Toc240112320 \h </w:instrText>
+              <w:instrText xml:space="preserve"> PAGEREF _Toc240227097 \h </w:instrText>
             </w:r>
             <w:r>
               <w:rPr>
@@ -3081,7 +3083,7 @@
                 <w:noProof/>
                 <w:webHidden/>
               </w:rPr>
-              <w:t>15</w:t>
+              <w:t>14</w:t>
             </w:r>
             <w:r>
               <w:rPr>
@@ -3105,7 +3107,7 @@
               <w:sz w:val="22"/>
             </w:rPr>
           </w:pPr>
-          <w:hyperlink w:anchor="_Toc240112321" w:history="1">
+          <w:hyperlink w:anchor="_Toc240227098" w:history="1">
             <w:r>
               <w:rPr>
                 <w:rStyle w:val="Hyperlink"/>
@@ -3133,7 +3135,7 @@
                 <w:noProof/>
                 <w:webHidden/>
               </w:rPr>
-              <w:instrText xml:space="preserve"> PAGEREF _Toc240112321 \h </w:instrText>
+              <w:instrText xml:space="preserve"> PAGEREF _Toc240227098 \h </w:instrText>
             </w:r>
             <w:r>
               <w:rPr>
@@ -3153,7 +3155,7 @@
                 <w:noProof/>
                 <w:webHidden/>
               </w:rPr>
-              <w:t>16</w:t>
+              <w:t>15</w:t>
             </w:r>
             <w:r>
               <w:rPr>
@@ -3177,7 +3179,7 @@
               <w:sz w:val="22"/>
             </w:rPr>
           </w:pPr>
-          <w:hyperlink w:anchor="_Toc240112322" w:history="1">
+          <w:hyperlink w:anchor="_Toc240227099" w:history="1">
             <w:r>
               <w:rPr>
                 <w:rStyle w:val="Hyperlink"/>
@@ -3205,7 +3207,7 @@
                 <w:noProof/>
                 <w:webHidden/>
               </w:rPr>
-              <w:instrText xml:space="preserve"> PAGEREF _Toc240112322 \h </w:instrText>
+              <w:instrText xml:space="preserve"> PAGEREF _Toc240227099 \h </w:instrText>
             </w:r>
             <w:r>
               <w:rPr>
@@ -3225,7 +3227,7 @@
                 <w:noProof/>
                 <w:webHidden/>
               </w:rPr>
-              <w:t>16</w:t>
+              <w:t>15</w:t>
             </w:r>
             <w:r>
               <w:rPr>
@@ -3249,7 +3251,7 @@
               <w:sz w:val="22"/>
             </w:rPr>
           </w:pPr>
-          <w:hyperlink w:anchor="_Toc240112323" w:history="1">
+          <w:hyperlink w:anchor="_Toc240227100" w:history="1">
             <w:r>
               <w:rPr>
                 <w:rStyle w:val="Hyperlink"/>
@@ -3277,7 +3279,7 @@
                 <w:noProof/>
                 <w:webHidden/>
               </w:rPr>
-              <w:instrText xml:space="preserve"> PAGEREF _Toc240112323 \h </w:instrText>
+              <w:instrText xml:space="preserve"> PAGEREF _Toc240227100 \h </w:instrText>
             </w:r>
             <w:r>
               <w:rPr>
@@ -3297,7 +3299,7 @@
                 <w:noProof/>
                 <w:webHidden/>
               </w:rPr>
-              <w:t>17</w:t>
+              <w:t>16</w:t>
             </w:r>
             <w:r>
               <w:rPr>
@@ -3321,7 +3323,7 @@
               <w:sz w:val="22"/>
             </w:rPr>
           </w:pPr>
-          <w:hyperlink w:anchor="_Toc240112324" w:history="1">
+          <w:hyperlink w:anchor="_Toc240227101" w:history="1">
             <w:r>
               <w:rPr>
                 <w:rStyle w:val="Hyperlink"/>
@@ -3349,7 +3351,7 @@
                 <w:noProof/>
                 <w:webHidden/>
               </w:rPr>
-              <w:instrText xml:space="preserve"> PAGEREF _Toc240112324 \h </w:instrText>
+              <w:instrText xml:space="preserve"> PAGEREF _Toc240227101 \h </w:instrText>
             </w:r>
             <w:r>
               <w:rPr>
@@ -3369,7 +3371,7 @@
                 <w:noProof/>
                 <w:webHidden/>
               </w:rPr>
-              <w:t>17</w:t>
+              <w:t>16</w:t>
             </w:r>
             <w:r>
               <w:rPr>
@@ -3393,7 +3395,7 @@
               <w:sz w:val="22"/>
             </w:rPr>
           </w:pPr>
-          <w:hyperlink w:anchor="_Toc240112325" w:history="1">
+          <w:hyperlink w:anchor="_Toc240227102" w:history="1">
             <w:r>
               <w:rPr>
                 <w:rStyle w:val="Hyperlink"/>
@@ -3421,7 +3423,7 @@
                 <w:noProof/>
                 <w:webHidden/>
               </w:rPr>
-              <w:instrText xml:space="preserve"> PAGEREF _Toc240112325 \h </w:instrText>
+              <w:instrText xml:space="preserve"> PAGEREF _Toc240227102 \h </w:instrText>
             </w:r>
             <w:r>
               <w:rPr>
@@ -3441,7 +3443,7 @@
                 <w:noProof/>
                 <w:webHidden/>
               </w:rPr>
-              <w:t>17</w:t>
+              <w:t>16</w:t>
             </w:r>
             <w:r>
               <w:rPr>
@@ -3465,7 +3467,7 @@
               <w:sz w:val="22"/>
             </w:rPr>
           </w:pPr>
-          <w:hyperlink w:anchor="_Toc240112326" w:history="1">
+          <w:hyperlink w:anchor="_Toc240227103" w:history="1">
             <w:r>
               <w:rPr>
                 <w:rStyle w:val="Hyperlink"/>
@@ -3493,7 +3495,7 @@
                 <w:noProof/>
                 <w:webHidden/>
               </w:rPr>
-              <w:instrText xml:space="preserve"> PAGEREF _Toc240112326 \h </w:instrText>
+              <w:instrText xml:space="preserve"> PAGEREF _Toc240227103 \h </w:instrText>
             </w:r>
             <w:r>
               <w:rPr>
@@ -3513,7 +3515,7 @@
                 <w:noProof/>
                 <w:webHidden/>
               </w:rPr>
-              <w:t>17</w:t>
+              <w:t>16</w:t>
             </w:r>
             <w:r>
               <w:rPr>
@@ -3537,7 +3539,7 @@
               <w:sz w:val="22"/>
             </w:rPr>
           </w:pPr>
-          <w:hyperlink w:anchor="_Toc240112327" w:history="1">
+          <w:hyperlink w:anchor="_Toc240227104" w:history="1">
             <w:r>
               <w:rPr>
                 <w:rStyle w:val="Hyperlink"/>
@@ -3565,7 +3567,7 @@
                 <w:noProof/>
                 <w:webHidden/>
               </w:rPr>
-              <w:instrText xml:space="preserve"> PAGEREF _Toc240112327 \h </w:instrText>
+              <w:instrText xml:space="preserve"> PAGEREF _Toc240227104 \h </w:instrText>
             </w:r>
             <w:r>
               <w:rPr>
@@ -3585,7 +3587,7 @@
                 <w:noProof/>
                 <w:webHidden/>
               </w:rPr>
-              <w:t>17</w:t>
+              <w:t>16</w:t>
             </w:r>
             <w:r>
               <w:rPr>
@@ -3609,7 +3611,7 @@
               <w:sz w:val="22"/>
             </w:rPr>
           </w:pPr>
-          <w:hyperlink w:anchor="_Toc240112328" w:history="1">
+          <w:hyperlink w:anchor="_Toc240227105" w:history="1">
             <w:r>
               <w:rPr>
                 <w:rStyle w:val="Hyperlink"/>
@@ -3637,7 +3639,7 @@
                 <w:noProof/>
                 <w:webHidden/>
               </w:rPr>
-              <w:instrText xml:space="preserve"> PAGEREF _Toc240112328 \h </w:instrText>
+              <w:instrText xml:space="preserve"> PAGEREF _Toc240227105 \h </w:instrText>
             </w:r>
             <w:r>
               <w:rPr>
@@ -3657,7 +3659,7 @@
                 <w:noProof/>
                 <w:webHidden/>
               </w:rPr>
-              <w:t>17</w:t>
+              <w:t>16</w:t>
             </w:r>
             <w:r>
               <w:rPr>
@@ -3681,7 +3683,7 @@
               <w:sz w:val="22"/>
             </w:rPr>
           </w:pPr>
-          <w:hyperlink w:anchor="_Toc240112329" w:history="1">
+          <w:hyperlink w:anchor="_Toc240227106" w:history="1">
             <w:r>
               <w:rPr>
                 <w:rStyle w:val="Hyperlink"/>
@@ -3709,7 +3711,7 @@
                 <w:noProof/>
                 <w:webHidden/>
               </w:rPr>
-              <w:instrText xml:space="preserve"> PAGEREF _Toc240112329 \h </w:instrText>
+              <w:instrText xml:space="preserve"> PAGEREF _Toc240227106 \h </w:instrText>
             </w:r>
             <w:r>
               <w:rPr>
@@ -3729,7 +3731,7 @@
                 <w:noProof/>
                 <w:webHidden/>
               </w:rPr>
-              <w:t>18</w:t>
+              <w:t>17</w:t>
             </w:r>
             <w:r>
               <w:rPr>
@@ -3753,7 +3755,7 @@
               <w:sz w:val="22"/>
             </w:rPr>
           </w:pPr>
-          <w:hyperlink w:anchor="_Toc240112330" w:history="1">
+          <w:hyperlink w:anchor="_Toc240227107" w:history="1">
             <w:r>
               <w:rPr>
                 <w:rStyle w:val="Hyperlink"/>
@@ -3781,7 +3783,7 @@
                 <w:noProof/>
                 <w:webHidden/>
               </w:rPr>
-              <w:instrText xml:space="preserve"> PAGEREF _Toc240112330 \h </w:instrText>
+              <w:instrText xml:space="preserve"> PAGEREF _Toc240227107 \h </w:instrText>
             </w:r>
             <w:r>
               <w:rPr>
@@ -3801,7 +3803,7 @@
                 <w:noProof/>
                 <w:webHidden/>
               </w:rPr>
-              <w:t>18</w:t>
+              <w:t>17</w:t>
             </w:r>
             <w:r>
               <w:rPr>
@@ -3825,7 +3827,7 @@
               <w:sz w:val="22"/>
             </w:rPr>
           </w:pPr>
-          <w:hyperlink w:anchor="_Toc240112331" w:history="1">
+          <w:hyperlink w:anchor="_Toc240227108" w:history="1">
             <w:r>
               <w:rPr>
                 <w:rStyle w:val="Hyperlink"/>
@@ -3852,7 +3854,7 @@
                 <w:noProof/>
                 <w:webHidden/>
               </w:rPr>
-              <w:instrText xml:space="preserve"> PAGEREF _Toc240112331 \h </w:instrText>
+              <w:instrText xml:space="preserve"> PAGEREF _Toc240227108 \h </w:instrText>
             </w:r>
             <w:r>
               <w:rPr>
@@ -3872,7 +3874,7 @@
                 <w:noProof/>
                 <w:webHidden/>
               </w:rPr>
-              <w:t>18</w:t>
+              <w:t>17</w:t>
             </w:r>
             <w:r>
               <w:rPr>
@@ -3896,7 +3898,7 @@
               <w:sz w:val="22"/>
             </w:rPr>
           </w:pPr>
-          <w:hyperlink w:anchor="_Toc240112332" w:history="1">
+          <w:hyperlink w:anchor="_Toc240227109" w:history="1">
             <w:r>
               <w:rPr>
                 <w:rStyle w:val="Hyperlink"/>
@@ -3923,7 +3925,7 @@
                 <w:noProof/>
                 <w:webHidden/>
               </w:rPr>
-              <w:instrText xml:space="preserve"> PAGEREF _Toc240112332 \h </w:instrText>
+              <w:instrText xml:space="preserve"> PAGEREF _Toc240227109 \h </w:instrText>
             </w:r>
             <w:r>
               <w:rPr>
@@ -3943,7 +3945,7 @@
                 <w:noProof/>
                 <w:webHidden/>
               </w:rPr>
-              <w:t>18</w:t>
+              <w:t>17</w:t>
             </w:r>
             <w:r>
               <w:rPr>
@@ -3967,7 +3969,7 @@
               <w:sz w:val="22"/>
             </w:rPr>
           </w:pPr>
-          <w:hyperlink w:anchor="_Toc240112333" w:history="1">
+          <w:hyperlink w:anchor="_Toc240227110" w:history="1">
             <w:r>
               <w:rPr>
                 <w:rStyle w:val="Hyperlink"/>
@@ -3994,7 +3996,7 @@
                 <w:noProof/>
                 <w:webHidden/>
               </w:rPr>
-              <w:instrText xml:space="preserve"> PAGEREF _Toc240112333 \h </w:instrText>
+              <w:instrText xml:space="preserve"> PAGEREF _Toc240227110 \h </w:instrText>
             </w:r>
             <w:r>
               <w:rPr>
@@ -4014,7 +4016,7 @@
                 <w:noProof/>
                 <w:webHidden/>
               </w:rPr>
-              <w:t>19</w:t>
+              <w:t>18</w:t>
             </w:r>
             <w:r>
               <w:rPr>
@@ -4038,7 +4040,7 @@
               <w:sz w:val="22"/>
             </w:rPr>
           </w:pPr>
-          <w:hyperlink w:anchor="_Toc240112334" w:history="1">
+          <w:hyperlink w:anchor="_Toc240227111" w:history="1">
             <w:r>
               <w:rPr>
                 <w:rStyle w:val="Hyperlink"/>
@@ -4065,7 +4067,7 @@
                 <w:noProof/>
                 <w:webHidden/>
               </w:rPr>
-              <w:instrText xml:space="preserve"> PAGEREF _Toc240112334 \h </w:instrText>
+              <w:instrText xml:space="preserve"> PAGEREF _Toc240227111 \h </w:instrText>
             </w:r>
             <w:r>
               <w:rPr>
@@ -4085,7 +4087,7 @@
                 <w:noProof/>
                 <w:webHidden/>
               </w:rPr>
-              <w:t>20</w:t>
+              <w:t>19</w:t>
             </w:r>
             <w:r>
               <w:rPr>
@@ -4109,7 +4111,7 @@
               <w:sz w:val="22"/>
             </w:rPr>
           </w:pPr>
-          <w:hyperlink w:anchor="_Toc240112335" w:history="1">
+          <w:hyperlink w:anchor="_Toc240227112" w:history="1">
             <w:r>
               <w:rPr>
                 <w:rStyle w:val="Hyperlink"/>
@@ -4136,7 +4138,7 @@
                 <w:noProof/>
                 <w:webHidden/>
               </w:rPr>
-              <w:instrText xml:space="preserve"> PAGEREF _Toc240112335 \h </w:instrText>
+              <w:instrText xml:space="preserve"> PAGEREF _Toc240227112 \h </w:instrText>
             </w:r>
             <w:r>
               <w:rPr>
@@ -4156,7 +4158,7 @@
                 <w:noProof/>
                 <w:webHidden/>
               </w:rPr>
-              <w:t>20</w:t>
+              <w:t>19</w:t>
             </w:r>
             <w:r>
               <w:rPr>
@@ -4180,7 +4182,7 @@
               <w:sz w:val="22"/>
             </w:rPr>
           </w:pPr>
-          <w:hyperlink w:anchor="_Toc240112336" w:history="1">
+          <w:hyperlink w:anchor="_Toc240227113" w:history="1">
             <w:r>
               <w:rPr>
                 <w:rStyle w:val="Hyperlink"/>
@@ -4207,7 +4209,7 @@
                 <w:noProof/>
                 <w:webHidden/>
               </w:rPr>
-              <w:instrText xml:space="preserve"> PAGEREF _Toc240112336 \h </w:instrText>
+              <w:instrText xml:space="preserve"> PAGEREF _Toc240227113 \h </w:instrText>
             </w:r>
             <w:r>
               <w:rPr>
@@ -4227,7 +4229,7 @@
                 <w:noProof/>
                 <w:webHidden/>
               </w:rPr>
-              <w:t>21</w:t>
+              <w:t>20</w:t>
             </w:r>
             <w:r>
               <w:rPr>
@@ -4251,7 +4253,7 @@
               <w:sz w:val="22"/>
             </w:rPr>
           </w:pPr>
-          <w:hyperlink w:anchor="_Toc240112337" w:history="1">
+          <w:hyperlink w:anchor="_Toc240227114" w:history="1">
             <w:r>
               <w:rPr>
                 <w:rStyle w:val="Hyperlink"/>
@@ -4278,7 +4280,7 @@
                 <w:noProof/>
                 <w:webHidden/>
               </w:rPr>
-              <w:instrText xml:space="preserve"> PAGEREF _Toc240112337 \h </w:instrText>
+              <w:instrText xml:space="preserve"> PAGEREF _Toc240227114 \h </w:instrText>
             </w:r>
             <w:r>
               <w:rPr>
@@ -4298,7 +4300,7 @@
                 <w:noProof/>
                 <w:webHidden/>
               </w:rPr>
-              <w:t>21</w:t>
+              <w:t>20</w:t>
             </w:r>
             <w:r>
               <w:rPr>
@@ -4322,7 +4324,7 @@
               <w:sz w:val="22"/>
             </w:rPr>
           </w:pPr>
-          <w:hyperlink w:anchor="_Toc240112338" w:history="1">
+          <w:hyperlink w:anchor="_Toc240227115" w:history="1">
             <w:r>
               <w:rPr>
                 <w:rStyle w:val="Hyperlink"/>
@@ -4349,7 +4351,7 @@
                 <w:noProof/>
                 <w:webHidden/>
               </w:rPr>
-              <w:instrText xml:space="preserve"> PAGEREF _Toc240112338 \h </w:instrText>
+              <w:instrText xml:space="preserve"> PAGEREF _Toc240227115 \h </w:instrText>
             </w:r>
             <w:r>
               <w:rPr>
@@ -4369,7 +4371,7 @@
                 <w:noProof/>
                 <w:webHidden/>
               </w:rPr>
-              <w:t>21</w:t>
+              <w:t>20</w:t>
             </w:r>
             <w:r>
               <w:rPr>
@@ -4394,7 +4396,7 @@
               <w:sz w:val="22"/>
             </w:rPr>
           </w:pPr>
-          <w:hyperlink w:anchor="_Toc240112339" w:history="1">
+          <w:hyperlink w:anchor="_Toc240227116" w:history="1">
             <w:r>
               <w:rPr>
                 <w:rStyle w:val="Hyperlink"/>
@@ -4437,7 +4439,7 @@
                 <w:noProof/>
                 <w:webHidden/>
               </w:rPr>
-              <w:instrText xml:space="preserve"> PAGEREF _Toc240112339 \h </w:instrText>
+              <w:instrText xml:space="preserve"> PAGEREF _Toc240227116 \h </w:instrText>
             </w:r>
             <w:r>
               <w:rPr>
@@ -4457,7 +4459,7 @@
                 <w:noProof/>
                 <w:webHidden/>
               </w:rPr>
-              <w:t>21</w:t>
+              <w:t>20</w:t>
             </w:r>
             <w:r>
               <w:rPr>
@@ -4482,7 +4484,7 @@
               <w:sz w:val="22"/>
             </w:rPr>
           </w:pPr>
-          <w:hyperlink w:anchor="_Toc240112340" w:history="1">
+          <w:hyperlink w:anchor="_Toc240227117" w:history="1">
             <w:r>
               <w:rPr>
                 <w:rStyle w:val="Hyperlink"/>
@@ -4525,7 +4527,7 @@
                 <w:noProof/>
                 <w:webHidden/>
               </w:rPr>
-              <w:instrText xml:space="preserve"> PAGEREF _Toc240112340 \h </w:instrText>
+              <w:instrText xml:space="preserve"> PAGEREF _Toc240227117 \h </w:instrText>
             </w:r>
             <w:r>
               <w:rPr>
@@ -4545,7 +4547,7 @@
                 <w:noProof/>
                 <w:webHidden/>
               </w:rPr>
-              <w:t>21</w:t>
+              <w:t>20</w:t>
             </w:r>
             <w:r>
               <w:rPr>
@@ -4570,7 +4572,7 @@
               <w:sz w:val="22"/>
             </w:rPr>
           </w:pPr>
-          <w:hyperlink w:anchor="_Toc240112341" w:history="1">
+          <w:hyperlink w:anchor="_Toc240227118" w:history="1">
             <w:r>
               <w:rPr>
                 <w:rStyle w:val="Hyperlink"/>
@@ -4613,7 +4615,7 @@
                 <w:noProof/>
                 <w:webHidden/>
               </w:rPr>
-              <w:instrText xml:space="preserve"> PAGEREF _Toc240112341 \h </w:instrText>
+              <w:instrText xml:space="preserve"> PAGEREF _Toc240227118 \h </w:instrText>
             </w:r>
             <w:r>
               <w:rPr>
@@ -4633,7 +4635,7 @@
                 <w:noProof/>
                 <w:webHidden/>
               </w:rPr>
-              <w:t>22</w:t>
+              <w:t>21</w:t>
             </w:r>
             <w:r>
               <w:rPr>
@@ -4658,7 +4660,7 @@
               <w:sz w:val="22"/>
             </w:rPr>
           </w:pPr>
-          <w:hyperlink w:anchor="_Toc240112342" w:history="1">
+          <w:hyperlink w:anchor="_Toc240227119" w:history="1">
             <w:r>
               <w:rPr>
                 <w:rStyle w:val="Hyperlink"/>
@@ -4701,7 +4703,7 @@
                 <w:noProof/>
                 <w:webHidden/>
               </w:rPr>
-              <w:instrText xml:space="preserve"> PAGEREF _Toc240112342 \h </w:instrText>
+              <w:instrText xml:space="preserve"> PAGEREF _Toc240227119 \h </w:instrText>
             </w:r>
             <w:r>
               <w:rPr>
@@ -4721,7 +4723,7 @@
                 <w:noProof/>
                 <w:webHidden/>
               </w:rPr>
-              <w:t>23</w:t>
+              <w:t>22</w:t>
             </w:r>
             <w:r>
               <w:rPr>
@@ -4746,7 +4748,7 @@
               <w:sz w:val="22"/>
             </w:rPr>
           </w:pPr>
-          <w:hyperlink w:anchor="_Toc240112343" w:history="1">
+          <w:hyperlink w:anchor="_Toc240227120" w:history="1">
             <w:r>
               <w:rPr>
                 <w:rStyle w:val="Hyperlink"/>
@@ -4789,7 +4791,7 @@
                 <w:noProof/>
                 <w:webHidden/>
               </w:rPr>
-              <w:instrText xml:space="preserve"> PAGEREF _Toc240112343 \h </w:instrText>
+              <w:instrText xml:space="preserve"> PAGEREF _Toc240227120 \h </w:instrText>
             </w:r>
             <w:r>
               <w:rPr>
@@ -4809,7 +4811,930 @@
                 <w:noProof/>
                 <w:webHidden/>
               </w:rPr>
+              <w:t>22</w:t>
+            </w:r>
+            <w:r>
+              <w:rPr>
+                <w:noProof/>
+                <w:webHidden/>
+              </w:rPr>
+              <w:fldChar w:fldCharType="end"/>
+            </w:r>
+          </w:hyperlink>
+        </w:p>
+        <w:p>
+          <w:pPr>
+            <w:pStyle w:val="TOC1"/>
+            <w:tabs>
+              <w:tab w:val="right" w:leader="dot" w:pos="10457"/>
+            </w:tabs>
+            <w:rPr>
+              <w:rFonts w:asciiTheme="minorHAnsi" w:eastAsiaTheme="minorEastAsia" w:hAnsiTheme="minorHAnsi"/>
+              <w:noProof/>
+              <w:color w:val="auto"/>
+              <w:sz w:val="22"/>
+            </w:rPr>
+          </w:pPr>
+          <w:hyperlink w:anchor="_Toc240227121" w:history="1">
+            <w:r>
+              <w:rPr>
+                <w:rStyle w:val="Hyperlink"/>
+                <w:noProof/>
+              </w:rPr>
+              <w:t>BÀI 11: CHƯƠNG TRÌNH PYTORCH TỔNG HỢP</w:t>
+            </w:r>
+            <w:r>
+              <w:rPr>
+                <w:noProof/>
+                <w:webHidden/>
+              </w:rPr>
+              <w:tab/>
+            </w:r>
+            <w:r>
+              <w:rPr>
+                <w:noProof/>
+                <w:webHidden/>
+              </w:rPr>
+              <w:fldChar w:fldCharType="begin"/>
+            </w:r>
+            <w:r>
+              <w:rPr>
+                <w:noProof/>
+                <w:webHidden/>
+              </w:rPr>
+              <w:instrText xml:space="preserve"> PAGEREF _Toc240227121 \h </w:instrText>
+            </w:r>
+            <w:r>
+              <w:rPr>
+                <w:noProof/>
+                <w:webHidden/>
+              </w:rPr>
+            </w:r>
+            <w:r>
+              <w:rPr>
+                <w:noProof/>
+                <w:webHidden/>
+              </w:rPr>
+              <w:fldChar w:fldCharType="separate"/>
+            </w:r>
+            <w:r>
+              <w:rPr>
+                <w:noProof/>
+                <w:webHidden/>
+              </w:rPr>
+              <w:t>22</w:t>
+            </w:r>
+            <w:r>
+              <w:rPr>
+                <w:noProof/>
+                <w:webHidden/>
+              </w:rPr>
+              <w:fldChar w:fldCharType="end"/>
+            </w:r>
+          </w:hyperlink>
+        </w:p>
+        <w:p>
+          <w:pPr>
+            <w:pStyle w:val="TOC2"/>
+            <w:tabs>
+              <w:tab w:val="right" w:leader="dot" w:pos="10457"/>
+            </w:tabs>
+            <w:rPr>
+              <w:rFonts w:asciiTheme="minorHAnsi" w:eastAsiaTheme="minorEastAsia" w:hAnsiTheme="minorHAnsi"/>
+              <w:noProof/>
+              <w:color w:val="auto"/>
+              <w:sz w:val="22"/>
+            </w:rPr>
+          </w:pPr>
+          <w:hyperlink w:anchor="_Toc240227122" w:history="1">
+            <w:r>
+              <w:rPr>
+                <w:rStyle w:val="Hyperlink"/>
+                <w:noProof/>
+              </w:rPr>
+              <w:t>11.1 Nội dung 1</w:t>
+            </w:r>
+            <w:r>
+              <w:rPr>
+                <w:noProof/>
+                <w:webHidden/>
+              </w:rPr>
+              <w:tab/>
+            </w:r>
+            <w:r>
+              <w:rPr>
+                <w:noProof/>
+                <w:webHidden/>
+              </w:rPr>
+              <w:fldChar w:fldCharType="begin"/>
+            </w:r>
+            <w:r>
+              <w:rPr>
+                <w:noProof/>
+                <w:webHidden/>
+              </w:rPr>
+              <w:instrText xml:space="preserve"> PAGEREF _Toc240227122 \h </w:instrText>
+            </w:r>
+            <w:r>
+              <w:rPr>
+                <w:noProof/>
+                <w:webHidden/>
+              </w:rPr>
+            </w:r>
+            <w:r>
+              <w:rPr>
+                <w:noProof/>
+                <w:webHidden/>
+              </w:rPr>
+              <w:fldChar w:fldCharType="separate"/>
+            </w:r>
+            <w:r>
+              <w:rPr>
+                <w:noProof/>
+                <w:webHidden/>
+              </w:rPr>
+              <w:t>22</w:t>
+            </w:r>
+            <w:r>
+              <w:rPr>
+                <w:noProof/>
+                <w:webHidden/>
+              </w:rPr>
+              <w:fldChar w:fldCharType="end"/>
+            </w:r>
+          </w:hyperlink>
+        </w:p>
+        <w:p>
+          <w:pPr>
+            <w:pStyle w:val="TOC2"/>
+            <w:tabs>
+              <w:tab w:val="right" w:leader="dot" w:pos="10457"/>
+            </w:tabs>
+            <w:rPr>
+              <w:rFonts w:asciiTheme="minorHAnsi" w:eastAsiaTheme="minorEastAsia" w:hAnsiTheme="minorHAnsi"/>
+              <w:noProof/>
+              <w:color w:val="auto"/>
+              <w:sz w:val="22"/>
+            </w:rPr>
+          </w:pPr>
+          <w:hyperlink w:anchor="_Toc240227123" w:history="1">
+            <w:r>
+              <w:rPr>
+                <w:rStyle w:val="Hyperlink"/>
+                <w:noProof/>
+              </w:rPr>
+              <w:t>11.2 Code</w:t>
+            </w:r>
+            <w:r>
+              <w:rPr>
+                <w:noProof/>
+                <w:webHidden/>
+              </w:rPr>
+              <w:tab/>
+            </w:r>
+            <w:r>
+              <w:rPr>
+                <w:noProof/>
+                <w:webHidden/>
+              </w:rPr>
+              <w:fldChar w:fldCharType="begin"/>
+            </w:r>
+            <w:r>
+              <w:rPr>
+                <w:noProof/>
+                <w:webHidden/>
+              </w:rPr>
+              <w:instrText xml:space="preserve"> PAGEREF _Toc240227123 \h </w:instrText>
+            </w:r>
+            <w:r>
+              <w:rPr>
+                <w:noProof/>
+                <w:webHidden/>
+              </w:rPr>
+            </w:r>
+            <w:r>
+              <w:rPr>
+                <w:noProof/>
+                <w:webHidden/>
+              </w:rPr>
+              <w:fldChar w:fldCharType="separate"/>
+            </w:r>
+            <w:r>
+              <w:rPr>
+                <w:noProof/>
+                <w:webHidden/>
+              </w:rPr>
+              <w:t>22</w:t>
+            </w:r>
+            <w:r>
+              <w:rPr>
+                <w:noProof/>
+                <w:webHidden/>
+              </w:rPr>
+              <w:fldChar w:fldCharType="end"/>
+            </w:r>
+          </w:hyperlink>
+        </w:p>
+        <w:p>
+          <w:pPr>
+            <w:pStyle w:val="TOC2"/>
+            <w:tabs>
+              <w:tab w:val="right" w:leader="dot" w:pos="10457"/>
+            </w:tabs>
+            <w:rPr>
+              <w:rFonts w:asciiTheme="minorHAnsi" w:eastAsiaTheme="minorEastAsia" w:hAnsiTheme="minorHAnsi"/>
+              <w:noProof/>
+              <w:color w:val="auto"/>
+              <w:sz w:val="22"/>
+            </w:rPr>
+          </w:pPr>
+          <w:hyperlink w:anchor="_Toc240227124" w:history="1">
+            <w:r>
+              <w:rPr>
+                <w:rStyle w:val="Hyperlink"/>
+                <w:noProof/>
+              </w:rPr>
+              <w:t>11.3 Kết quả chạy:</w:t>
+            </w:r>
+            <w:r>
+              <w:rPr>
+                <w:noProof/>
+                <w:webHidden/>
+              </w:rPr>
+              <w:tab/>
+            </w:r>
+            <w:r>
+              <w:rPr>
+                <w:noProof/>
+                <w:webHidden/>
+              </w:rPr>
+              <w:fldChar w:fldCharType="begin"/>
+            </w:r>
+            <w:r>
+              <w:rPr>
+                <w:noProof/>
+                <w:webHidden/>
+              </w:rPr>
+              <w:instrText xml:space="preserve"> PAGEREF _Toc240227124 \h </w:instrText>
+            </w:r>
+            <w:r>
+              <w:rPr>
+                <w:noProof/>
+                <w:webHidden/>
+              </w:rPr>
+            </w:r>
+            <w:r>
+              <w:rPr>
+                <w:noProof/>
+                <w:webHidden/>
+              </w:rPr>
+              <w:fldChar w:fldCharType="separate"/>
+            </w:r>
+            <w:r>
+              <w:rPr>
+                <w:noProof/>
+                <w:webHidden/>
+              </w:rPr>
               <w:t>23</w:t>
+            </w:r>
+            <w:r>
+              <w:rPr>
+                <w:noProof/>
+                <w:webHidden/>
+              </w:rPr>
+              <w:fldChar w:fldCharType="end"/>
+            </w:r>
+          </w:hyperlink>
+        </w:p>
+        <w:p>
+          <w:pPr>
+            <w:pStyle w:val="TOC2"/>
+            <w:tabs>
+              <w:tab w:val="right" w:leader="dot" w:pos="10457"/>
+            </w:tabs>
+            <w:rPr>
+              <w:rFonts w:asciiTheme="minorHAnsi" w:eastAsiaTheme="minorEastAsia" w:hAnsiTheme="minorHAnsi"/>
+              <w:noProof/>
+              <w:color w:val="auto"/>
+              <w:sz w:val="22"/>
+            </w:rPr>
+          </w:pPr>
+          <w:hyperlink w:anchor="_Toc240227125" w:history="1">
+            <w:r>
+              <w:rPr>
+                <w:rStyle w:val="Hyperlink"/>
+                <w:noProof/>
+              </w:rPr>
+              <w:t>11.4 Nội dung 2</w:t>
+            </w:r>
+            <w:r>
+              <w:rPr>
+                <w:noProof/>
+                <w:webHidden/>
+              </w:rPr>
+              <w:tab/>
+            </w:r>
+            <w:r>
+              <w:rPr>
+                <w:noProof/>
+                <w:webHidden/>
+              </w:rPr>
+              <w:fldChar w:fldCharType="begin"/>
+            </w:r>
+            <w:r>
+              <w:rPr>
+                <w:noProof/>
+                <w:webHidden/>
+              </w:rPr>
+              <w:instrText xml:space="preserve"> PAGEREF _Toc240227125 \h </w:instrText>
+            </w:r>
+            <w:r>
+              <w:rPr>
+                <w:noProof/>
+                <w:webHidden/>
+              </w:rPr>
+            </w:r>
+            <w:r>
+              <w:rPr>
+                <w:noProof/>
+                <w:webHidden/>
+              </w:rPr>
+              <w:fldChar w:fldCharType="separate"/>
+            </w:r>
+            <w:r>
+              <w:rPr>
+                <w:noProof/>
+                <w:webHidden/>
+              </w:rPr>
+              <w:t>23</w:t>
+            </w:r>
+            <w:r>
+              <w:rPr>
+                <w:noProof/>
+                <w:webHidden/>
+              </w:rPr>
+              <w:fldChar w:fldCharType="end"/>
+            </w:r>
+          </w:hyperlink>
+        </w:p>
+        <w:p>
+          <w:pPr>
+            <w:pStyle w:val="TOC2"/>
+            <w:tabs>
+              <w:tab w:val="right" w:leader="dot" w:pos="10457"/>
+            </w:tabs>
+            <w:rPr>
+              <w:rFonts w:asciiTheme="minorHAnsi" w:eastAsiaTheme="minorEastAsia" w:hAnsiTheme="minorHAnsi"/>
+              <w:noProof/>
+              <w:color w:val="auto"/>
+              <w:sz w:val="22"/>
+            </w:rPr>
+          </w:pPr>
+          <w:hyperlink w:anchor="_Toc240227126" w:history="1">
+            <w:r>
+              <w:rPr>
+                <w:rStyle w:val="Hyperlink"/>
+                <w:noProof/>
+              </w:rPr>
+              <w:t>11.5 Code</w:t>
+            </w:r>
+            <w:r>
+              <w:rPr>
+                <w:noProof/>
+                <w:webHidden/>
+              </w:rPr>
+              <w:tab/>
+            </w:r>
+            <w:r>
+              <w:rPr>
+                <w:noProof/>
+                <w:webHidden/>
+              </w:rPr>
+              <w:fldChar w:fldCharType="begin"/>
+            </w:r>
+            <w:r>
+              <w:rPr>
+                <w:noProof/>
+                <w:webHidden/>
+              </w:rPr>
+              <w:instrText xml:space="preserve"> PAGEREF _Toc240227126 \h </w:instrText>
+            </w:r>
+            <w:r>
+              <w:rPr>
+                <w:noProof/>
+                <w:webHidden/>
+              </w:rPr>
+            </w:r>
+            <w:r>
+              <w:rPr>
+                <w:noProof/>
+                <w:webHidden/>
+              </w:rPr>
+              <w:fldChar w:fldCharType="separate"/>
+            </w:r>
+            <w:r>
+              <w:rPr>
+                <w:noProof/>
+                <w:webHidden/>
+              </w:rPr>
+              <w:t>23</w:t>
+            </w:r>
+            <w:r>
+              <w:rPr>
+                <w:noProof/>
+                <w:webHidden/>
+              </w:rPr>
+              <w:fldChar w:fldCharType="end"/>
+            </w:r>
+          </w:hyperlink>
+        </w:p>
+        <w:p>
+          <w:pPr>
+            <w:pStyle w:val="TOC2"/>
+            <w:tabs>
+              <w:tab w:val="right" w:leader="dot" w:pos="10457"/>
+            </w:tabs>
+            <w:rPr>
+              <w:rFonts w:asciiTheme="minorHAnsi" w:eastAsiaTheme="minorEastAsia" w:hAnsiTheme="minorHAnsi"/>
+              <w:noProof/>
+              <w:color w:val="auto"/>
+              <w:sz w:val="22"/>
+            </w:rPr>
+          </w:pPr>
+          <w:hyperlink w:anchor="_Toc240227127" w:history="1">
+            <w:r>
+              <w:rPr>
+                <w:rStyle w:val="Hyperlink"/>
+                <w:noProof/>
+              </w:rPr>
+              <w:t>11.6 Kết quả chạy</w:t>
+            </w:r>
+            <w:r>
+              <w:rPr>
+                <w:noProof/>
+                <w:webHidden/>
+              </w:rPr>
+              <w:tab/>
+            </w:r>
+            <w:r>
+              <w:rPr>
+                <w:noProof/>
+                <w:webHidden/>
+              </w:rPr>
+              <w:fldChar w:fldCharType="begin"/>
+            </w:r>
+            <w:r>
+              <w:rPr>
+                <w:noProof/>
+                <w:webHidden/>
+              </w:rPr>
+              <w:instrText xml:space="preserve"> PAGEREF _Toc240227127 \h </w:instrText>
+            </w:r>
+            <w:r>
+              <w:rPr>
+                <w:noProof/>
+                <w:webHidden/>
+              </w:rPr>
+            </w:r>
+            <w:r>
+              <w:rPr>
+                <w:noProof/>
+                <w:webHidden/>
+              </w:rPr>
+              <w:fldChar w:fldCharType="separate"/>
+            </w:r>
+            <w:r>
+              <w:rPr>
+                <w:noProof/>
+                <w:webHidden/>
+              </w:rPr>
+              <w:t>24</w:t>
+            </w:r>
+            <w:r>
+              <w:rPr>
+                <w:noProof/>
+                <w:webHidden/>
+              </w:rPr>
+              <w:fldChar w:fldCharType="end"/>
+            </w:r>
+          </w:hyperlink>
+        </w:p>
+        <w:p>
+          <w:pPr>
+            <w:pStyle w:val="TOC2"/>
+            <w:tabs>
+              <w:tab w:val="right" w:leader="dot" w:pos="10457"/>
+            </w:tabs>
+            <w:rPr>
+              <w:rFonts w:asciiTheme="minorHAnsi" w:eastAsiaTheme="minorEastAsia" w:hAnsiTheme="minorHAnsi"/>
+              <w:noProof/>
+              <w:color w:val="auto"/>
+              <w:sz w:val="22"/>
+            </w:rPr>
+          </w:pPr>
+          <w:hyperlink w:anchor="_Toc240227128" w:history="1">
+            <w:r>
+              <w:rPr>
+                <w:rStyle w:val="Hyperlink"/>
+                <w:noProof/>
+              </w:rPr>
+              <w:t>11.7 Nội dung 3</w:t>
+            </w:r>
+            <w:r>
+              <w:rPr>
+                <w:noProof/>
+                <w:webHidden/>
+              </w:rPr>
+              <w:tab/>
+            </w:r>
+            <w:r>
+              <w:rPr>
+                <w:noProof/>
+                <w:webHidden/>
+              </w:rPr>
+              <w:fldChar w:fldCharType="begin"/>
+            </w:r>
+            <w:r>
+              <w:rPr>
+                <w:noProof/>
+                <w:webHidden/>
+              </w:rPr>
+              <w:instrText xml:space="preserve"> PAGEREF _Toc240227128 \h </w:instrText>
+            </w:r>
+            <w:r>
+              <w:rPr>
+                <w:noProof/>
+                <w:webHidden/>
+              </w:rPr>
+            </w:r>
+            <w:r>
+              <w:rPr>
+                <w:noProof/>
+                <w:webHidden/>
+              </w:rPr>
+              <w:fldChar w:fldCharType="separate"/>
+            </w:r>
+            <w:r>
+              <w:rPr>
+                <w:noProof/>
+                <w:webHidden/>
+              </w:rPr>
+              <w:t>24</w:t>
+            </w:r>
+            <w:r>
+              <w:rPr>
+                <w:noProof/>
+                <w:webHidden/>
+              </w:rPr>
+              <w:fldChar w:fldCharType="end"/>
+            </w:r>
+          </w:hyperlink>
+        </w:p>
+        <w:p>
+          <w:pPr>
+            <w:pStyle w:val="TOC2"/>
+            <w:tabs>
+              <w:tab w:val="right" w:leader="dot" w:pos="10457"/>
+            </w:tabs>
+            <w:rPr>
+              <w:rFonts w:asciiTheme="minorHAnsi" w:eastAsiaTheme="minorEastAsia" w:hAnsiTheme="minorHAnsi"/>
+              <w:noProof/>
+              <w:color w:val="auto"/>
+              <w:sz w:val="22"/>
+            </w:rPr>
+          </w:pPr>
+          <w:hyperlink w:anchor="_Toc240227129" w:history="1">
+            <w:r>
+              <w:rPr>
+                <w:rStyle w:val="Hyperlink"/>
+                <w:noProof/>
+              </w:rPr>
+              <w:t>11.8 Code</w:t>
+            </w:r>
+            <w:r>
+              <w:rPr>
+                <w:noProof/>
+                <w:webHidden/>
+              </w:rPr>
+              <w:tab/>
+            </w:r>
+            <w:r>
+              <w:rPr>
+                <w:noProof/>
+                <w:webHidden/>
+              </w:rPr>
+              <w:fldChar w:fldCharType="begin"/>
+            </w:r>
+            <w:r>
+              <w:rPr>
+                <w:noProof/>
+                <w:webHidden/>
+              </w:rPr>
+              <w:instrText xml:space="preserve"> PAGEREF _Toc240227129 \h </w:instrText>
+            </w:r>
+            <w:r>
+              <w:rPr>
+                <w:noProof/>
+                <w:webHidden/>
+              </w:rPr>
+            </w:r>
+            <w:r>
+              <w:rPr>
+                <w:noProof/>
+                <w:webHidden/>
+              </w:rPr>
+              <w:fldChar w:fldCharType="separate"/>
+            </w:r>
+            <w:r>
+              <w:rPr>
+                <w:noProof/>
+                <w:webHidden/>
+              </w:rPr>
+              <w:t>24</w:t>
+            </w:r>
+            <w:r>
+              <w:rPr>
+                <w:noProof/>
+                <w:webHidden/>
+              </w:rPr>
+              <w:fldChar w:fldCharType="end"/>
+            </w:r>
+          </w:hyperlink>
+        </w:p>
+        <w:p>
+          <w:pPr>
+            <w:pStyle w:val="TOC2"/>
+            <w:tabs>
+              <w:tab w:val="right" w:leader="dot" w:pos="10457"/>
+            </w:tabs>
+            <w:rPr>
+              <w:rFonts w:asciiTheme="minorHAnsi" w:eastAsiaTheme="minorEastAsia" w:hAnsiTheme="minorHAnsi"/>
+              <w:noProof/>
+              <w:color w:val="auto"/>
+              <w:sz w:val="22"/>
+            </w:rPr>
+          </w:pPr>
+          <w:hyperlink w:anchor="_Toc240227130" w:history="1">
+            <w:r>
+              <w:rPr>
+                <w:rStyle w:val="Hyperlink"/>
+                <w:noProof/>
+              </w:rPr>
+              <w:t>11.9 Kết quả chạy</w:t>
+            </w:r>
+            <w:r>
+              <w:rPr>
+                <w:noProof/>
+                <w:webHidden/>
+              </w:rPr>
+              <w:tab/>
+            </w:r>
+            <w:r>
+              <w:rPr>
+                <w:noProof/>
+                <w:webHidden/>
+              </w:rPr>
+              <w:fldChar w:fldCharType="begin"/>
+            </w:r>
+            <w:r>
+              <w:rPr>
+                <w:noProof/>
+                <w:webHidden/>
+              </w:rPr>
+              <w:instrText xml:space="preserve"> PAGEREF _Toc240227130 \h </w:instrText>
+            </w:r>
+            <w:r>
+              <w:rPr>
+                <w:noProof/>
+                <w:webHidden/>
+              </w:rPr>
+            </w:r>
+            <w:r>
+              <w:rPr>
+                <w:noProof/>
+                <w:webHidden/>
+              </w:rPr>
+              <w:fldChar w:fldCharType="separate"/>
+            </w:r>
+            <w:r>
+              <w:rPr>
+                <w:noProof/>
+                <w:webHidden/>
+              </w:rPr>
+              <w:t>25</w:t>
+            </w:r>
+            <w:r>
+              <w:rPr>
+                <w:noProof/>
+                <w:webHidden/>
+              </w:rPr>
+              <w:fldChar w:fldCharType="end"/>
+            </w:r>
+          </w:hyperlink>
+        </w:p>
+        <w:p>
+          <w:pPr>
+            <w:pStyle w:val="TOC2"/>
+            <w:tabs>
+              <w:tab w:val="right" w:leader="dot" w:pos="10457"/>
+            </w:tabs>
+            <w:rPr>
+              <w:rFonts w:asciiTheme="minorHAnsi" w:eastAsiaTheme="minorEastAsia" w:hAnsiTheme="minorHAnsi"/>
+              <w:noProof/>
+              <w:color w:val="auto"/>
+              <w:sz w:val="22"/>
+            </w:rPr>
+          </w:pPr>
+          <w:hyperlink w:anchor="_Toc240227131" w:history="1">
+            <w:r>
+              <w:rPr>
+                <w:rStyle w:val="Hyperlink"/>
+                <w:noProof/>
+              </w:rPr>
+              <w:t>11.10 Nội dung 4</w:t>
+            </w:r>
+            <w:r>
+              <w:rPr>
+                <w:noProof/>
+                <w:webHidden/>
+              </w:rPr>
+              <w:tab/>
+            </w:r>
+            <w:r>
+              <w:rPr>
+                <w:noProof/>
+                <w:webHidden/>
+              </w:rPr>
+              <w:fldChar w:fldCharType="begin"/>
+            </w:r>
+            <w:r>
+              <w:rPr>
+                <w:noProof/>
+                <w:webHidden/>
+              </w:rPr>
+              <w:instrText xml:space="preserve"> PAGEREF _Toc240227131 \h </w:instrText>
+            </w:r>
+            <w:r>
+              <w:rPr>
+                <w:noProof/>
+                <w:webHidden/>
+              </w:rPr>
+            </w:r>
+            <w:r>
+              <w:rPr>
+                <w:noProof/>
+                <w:webHidden/>
+              </w:rPr>
+              <w:fldChar w:fldCharType="separate"/>
+            </w:r>
+            <w:r>
+              <w:rPr>
+                <w:noProof/>
+                <w:webHidden/>
+              </w:rPr>
+              <w:t>25</w:t>
+            </w:r>
+            <w:r>
+              <w:rPr>
+                <w:noProof/>
+                <w:webHidden/>
+              </w:rPr>
+              <w:fldChar w:fldCharType="end"/>
+            </w:r>
+          </w:hyperlink>
+        </w:p>
+        <w:p>
+          <w:pPr>
+            <w:pStyle w:val="TOC2"/>
+            <w:tabs>
+              <w:tab w:val="right" w:leader="dot" w:pos="10457"/>
+            </w:tabs>
+            <w:rPr>
+              <w:rFonts w:asciiTheme="minorHAnsi" w:eastAsiaTheme="minorEastAsia" w:hAnsiTheme="minorHAnsi"/>
+              <w:noProof/>
+              <w:color w:val="auto"/>
+              <w:sz w:val="22"/>
+            </w:rPr>
+          </w:pPr>
+          <w:hyperlink w:anchor="_Toc240227132" w:history="1">
+            <w:r>
+              <w:rPr>
+                <w:rStyle w:val="Hyperlink"/>
+                <w:noProof/>
+              </w:rPr>
+              <w:t>11.11 Code</w:t>
+            </w:r>
+            <w:r>
+              <w:rPr>
+                <w:noProof/>
+                <w:webHidden/>
+              </w:rPr>
+              <w:tab/>
+            </w:r>
+            <w:r>
+              <w:rPr>
+                <w:noProof/>
+                <w:webHidden/>
+              </w:rPr>
+              <w:fldChar w:fldCharType="begin"/>
+            </w:r>
+            <w:r>
+              <w:rPr>
+                <w:noProof/>
+                <w:webHidden/>
+              </w:rPr>
+              <w:instrText xml:space="preserve"> PAGEREF _Toc240227132 \h </w:instrText>
+            </w:r>
+            <w:r>
+              <w:rPr>
+                <w:noProof/>
+                <w:webHidden/>
+              </w:rPr>
+            </w:r>
+            <w:r>
+              <w:rPr>
+                <w:noProof/>
+                <w:webHidden/>
+              </w:rPr>
+              <w:fldChar w:fldCharType="separate"/>
+            </w:r>
+            <w:r>
+              <w:rPr>
+                <w:noProof/>
+                <w:webHidden/>
+              </w:rPr>
+              <w:t>25</w:t>
+            </w:r>
+            <w:r>
+              <w:rPr>
+                <w:noProof/>
+                <w:webHidden/>
+              </w:rPr>
+              <w:fldChar w:fldCharType="end"/>
+            </w:r>
+          </w:hyperlink>
+        </w:p>
+        <w:p>
+          <w:pPr>
+            <w:pStyle w:val="TOC2"/>
+            <w:tabs>
+              <w:tab w:val="right" w:leader="dot" w:pos="10457"/>
+            </w:tabs>
+            <w:rPr>
+              <w:rFonts w:asciiTheme="minorHAnsi" w:eastAsiaTheme="minorEastAsia" w:hAnsiTheme="minorHAnsi"/>
+              <w:noProof/>
+              <w:color w:val="auto"/>
+              <w:sz w:val="22"/>
+            </w:rPr>
+          </w:pPr>
+          <w:hyperlink w:anchor="_Toc240227133" w:history="1">
+            <w:r>
+              <w:rPr>
+                <w:rStyle w:val="Hyperlink"/>
+                <w:noProof/>
+              </w:rPr>
+              <w:t>11.12 kết quả chạy</w:t>
+            </w:r>
+            <w:r>
+              <w:rPr>
+                <w:noProof/>
+                <w:webHidden/>
+              </w:rPr>
+              <w:tab/>
+            </w:r>
+            <w:r>
+              <w:rPr>
+                <w:noProof/>
+                <w:webHidden/>
+              </w:rPr>
+              <w:fldChar w:fldCharType="begin"/>
+            </w:r>
+            <w:r>
+              <w:rPr>
+                <w:noProof/>
+                <w:webHidden/>
+              </w:rPr>
+              <w:instrText xml:space="preserve"> PAGEREF _Toc240227133 \h </w:instrText>
+            </w:r>
+            <w:r>
+              <w:rPr>
+                <w:noProof/>
+                <w:webHidden/>
+              </w:rPr>
+            </w:r>
+            <w:r>
+              <w:rPr>
+                <w:noProof/>
+                <w:webHidden/>
+              </w:rPr>
+              <w:fldChar w:fldCharType="separate"/>
+            </w:r>
+            <w:r>
+              <w:rPr>
+                <w:noProof/>
+                <w:webHidden/>
+              </w:rPr>
+              <w:t>27</w:t>
             </w:r>
             <w:r>
               <w:rPr>
@@ -4827,6 +5752,7 @@
               <w:bCs/>
               <w:noProof/>
             </w:rPr>
+            <w:lastRenderedPageBreak/>
             <w:fldChar w:fldCharType="end"/>
           </w:r>
         </w:p>
@@ -4834,33 +5760,17 @@
     </w:sdt>
     <w:p>
       <w:pPr>
-        <w:spacing w:line="360" w:lineRule="auto"/>
-        <w:jc w:val="left"/>
-        <w:rPr>
-          <w:rFonts w:cs="Times New Roman"/>
-        </w:rPr>
-      </w:pPr>
-      <w:r>
-        <w:rPr>
-          <w:rFonts w:cs="Times New Roman"/>
-        </w:rPr>
-        <w:br w:type="page"/>
-      </w:r>
-    </w:p>
-    <w:p>
-      <w:pPr>
         <w:pStyle w:val="Heading1"/>
         <w:spacing w:line="360" w:lineRule="auto"/>
         <w:rPr>
           <w:rFonts w:cs="Times New Roman"/>
         </w:rPr>
       </w:pPr>
-      <w:bookmarkStart w:id="0" w:name="_Toc240112288"/>
-      <w:r>
-        <w:rPr>
-          <w:rFonts w:cs="Times New Roman"/>
-        </w:rPr>
-        <w:lastRenderedPageBreak/>
+      <w:bookmarkStart w:id="0" w:name="_Toc240227065"/>
+      <w:r>
+        <w:rPr>
+          <w:rFonts w:cs="Times New Roman"/>
+        </w:rPr>
         <w:t>BÀI 1: TẠO TENSOR CƠ BẢN</w:t>
       </w:r>
       <w:bookmarkEnd w:id="0"/>
@@ -4869,7 +5779,7 @@
       <w:pPr>
         <w:pStyle w:val="Heading2"/>
       </w:pPr>
-      <w:bookmarkStart w:id="1" w:name="_Toc240112289"/>
+      <w:bookmarkStart w:id="1" w:name="_Toc240227066"/>
       <w:r>
         <w:t xml:space="preserve">1.1 </w:t>
       </w:r>
@@ -4904,7 +5814,7 @@
           <w:rFonts w:cs="Times New Roman"/>
         </w:rPr>
       </w:pPr>
-      <w:bookmarkStart w:id="2" w:name="_Toc240112290"/>
+      <w:bookmarkStart w:id="2" w:name="_Toc240227067"/>
       <w:r>
         <w:rPr>
           <w:rFonts w:cs="Times New Roman"/>
@@ -4929,15 +5839,15 @@
         <w:tblLook w:val="04A0" w:firstRow="1" w:lastRow="0" w:firstColumn="1" w:lastColumn="0" w:noHBand="0" w:noVBand="1"/>
       </w:tblPr>
       <w:tblGrid>
-        <w:gridCol w:w="9634"/>
+        <w:gridCol w:w="10365"/>
       </w:tblGrid>
       <w:tr>
         <w:trPr>
-          <w:trHeight w:val="3047"/>
+          <w:trHeight w:val="3110"/>
         </w:trPr>
         <w:tc>
           <w:tcPr>
-            <w:tcW w:w="9634" w:type="dxa"/>
+            <w:tcW w:w="10365" w:type="dxa"/>
             <w:shd w:val="clear" w:color="auto" w:fill="D9D9D9" w:themeFill="background1" w:themeFillShade="D9"/>
           </w:tcPr>
           <w:p>
@@ -5122,67 +6032,13 @@
     </w:p>
     <w:p>
       <w:pPr>
-        <w:spacing w:line="360" w:lineRule="auto"/>
-      </w:pPr>
-    </w:p>
-    <w:p>
-      <w:pPr>
         <w:pStyle w:val="Heading2"/>
         <w:spacing w:line="360" w:lineRule="auto"/>
         <w:rPr>
           <w:rFonts w:cs="Times New Roman"/>
         </w:rPr>
       </w:pPr>
-    </w:p>
-    <w:p>
-      <w:pPr>
-        <w:spacing w:line="360" w:lineRule="auto"/>
-        <w:rPr>
-          <w:rFonts w:cs="Times New Roman"/>
-        </w:rPr>
-      </w:pPr>
-    </w:p>
-    <w:p>
-      <w:pPr>
-        <w:spacing w:line="360" w:lineRule="auto"/>
-        <w:rPr>
-          <w:rFonts w:cs="Times New Roman"/>
-        </w:rPr>
-      </w:pPr>
-    </w:p>
-    <w:p>
-      <w:pPr>
-        <w:spacing w:line="360" w:lineRule="auto"/>
-        <w:rPr>
-          <w:rFonts w:cs="Times New Roman"/>
-        </w:rPr>
-      </w:pPr>
-    </w:p>
-    <w:p>
-      <w:pPr>
-        <w:spacing w:line="360" w:lineRule="auto"/>
-        <w:rPr>
-          <w:rFonts w:cs="Times New Roman"/>
-        </w:rPr>
-      </w:pPr>
-    </w:p>
-    <w:p>
-      <w:pPr>
-        <w:spacing w:line="360" w:lineRule="auto"/>
-        <w:rPr>
-          <w:rFonts w:cs="Times New Roman"/>
-        </w:rPr>
-      </w:pPr>
-    </w:p>
-    <w:p>
-      <w:pPr>
-        <w:pStyle w:val="Heading2"/>
-        <w:spacing w:line="360" w:lineRule="auto"/>
-        <w:rPr>
-          <w:rFonts w:cs="Times New Roman"/>
-        </w:rPr>
-      </w:pPr>
-      <w:bookmarkStart w:id="3" w:name="_Toc240112291"/>
+      <w:bookmarkStart w:id="3" w:name="_Toc240227068"/>
       <w:r>
         <w:rPr>
           <w:rFonts w:cs="Times New Roman"/>
@@ -5201,6 +6057,7 @@
       <w:r>
         <w:rPr>
           <w:rFonts w:cs="Times New Roman"/>
+          <w:noProof/>
         </w:rPr>
         <w:drawing>
           <wp:inline distT="0" distB="0" distL="0" distR="0" wp14:anchorId="7F122C89" wp14:editId="77439008">
@@ -5255,7 +6112,7 @@
           <w:rFonts w:cs="Times New Roman"/>
         </w:rPr>
       </w:pPr>
-      <w:bookmarkStart w:id="4" w:name="_Toc240112292"/>
+      <w:bookmarkStart w:id="4" w:name="_Toc240227069"/>
       <w:r>
         <w:rPr>
           <w:rFonts w:cs="Times New Roman"/>
@@ -5338,7 +6195,7 @@
           <w:rFonts w:cs="Times New Roman"/>
         </w:rPr>
       </w:pPr>
-      <w:bookmarkStart w:id="5" w:name="_Toc240112293"/>
+      <w:bookmarkStart w:id="5" w:name="_Toc240227070"/>
       <w:r>
         <w:rPr>
           <w:rFonts w:cs="Times New Roman"/>
@@ -5356,7 +6213,7 @@
           <w:rFonts w:cs="Times New Roman"/>
         </w:rPr>
       </w:pPr>
-      <w:bookmarkStart w:id="6" w:name="_Toc240112294"/>
+      <w:bookmarkStart w:id="6" w:name="_Toc240227071"/>
       <w:r>
         <w:rPr>
           <w:rFonts w:cs="Times New Roman"/>
@@ -5387,7 +6244,7 @@
           <w:rFonts w:cs="Times New Roman"/>
         </w:rPr>
       </w:pPr>
-      <w:bookmarkStart w:id="7" w:name="_Toc240112295"/>
+      <w:bookmarkStart w:id="7" w:name="_Toc240227072"/>
       <w:r>
         <w:rPr>
           <w:rFonts w:cs="Times New Roman"/>
@@ -5395,14 +6252,6 @@
         <w:t>2.2 Code</w:t>
       </w:r>
       <w:bookmarkEnd w:id="7"/>
-    </w:p>
-    <w:p>
-      <w:pPr>
-        <w:spacing w:line="360" w:lineRule="auto"/>
-        <w:rPr>
-          <w:rFonts w:cs="Times New Roman"/>
-        </w:rPr>
-      </w:pPr>
     </w:p>
     <w:tbl>
       <w:tblPr>
@@ -5706,12 +6555,11 @@
           <w:rFonts w:cs="Times New Roman"/>
         </w:rPr>
       </w:pPr>
-      <w:bookmarkStart w:id="8" w:name="_Toc240112296"/>
-      <w:r>
-        <w:rPr>
-          <w:rFonts w:cs="Times New Roman"/>
-        </w:rPr>
-        <w:lastRenderedPageBreak/>
+      <w:bookmarkStart w:id="8" w:name="_Toc240227073"/>
+      <w:r>
+        <w:rPr>
+          <w:rFonts w:cs="Times New Roman"/>
+        </w:rPr>
         <w:t>2.3 Kết quả chạy</w:t>
       </w:r>
       <w:bookmarkEnd w:id="8"/>
@@ -5726,6 +6574,7 @@
       <w:r>
         <w:rPr>
           <w:rFonts w:cs="Times New Roman"/>
+          <w:noProof/>
         </w:rPr>
         <w:drawing>
           <wp:inline distT="0" distB="0" distL="0" distR="0" wp14:anchorId="721A316A" wp14:editId="71E6B6C0">
@@ -5782,6 +6631,7 @@
       <w:r>
         <w:rPr>
           <w:rFonts w:cs="Times New Roman"/>
+          <w:noProof/>
         </w:rPr>
         <w:drawing>
           <wp:inline distT="0" distB="0" distL="0" distR="0" wp14:anchorId="54DE75DC" wp14:editId="755C58E7">
@@ -5836,7 +6686,7 @@
           <w:rFonts w:cs="Times New Roman"/>
         </w:rPr>
       </w:pPr>
-      <w:bookmarkStart w:id="9" w:name="_Toc240112297"/>
+      <w:bookmarkStart w:id="9" w:name="_Toc240227074"/>
       <w:r>
         <w:rPr>
           <w:rFonts w:cs="Times New Roman"/>
@@ -5993,7 +6843,7 @@
           <w:rFonts w:cs="Times New Roman"/>
         </w:rPr>
       </w:pPr>
-      <w:bookmarkStart w:id="10" w:name="_Toc240112298"/>
+      <w:bookmarkStart w:id="10" w:name="_Toc240227075"/>
       <w:r>
         <w:rPr>
           <w:rFonts w:cs="Times New Roman"/>
@@ -6010,7 +6860,7 @@
           <w:rFonts w:cs="Times New Roman"/>
         </w:rPr>
       </w:pPr>
-      <w:bookmarkStart w:id="11" w:name="_Toc240112299"/>
+      <w:bookmarkStart w:id="11" w:name="_Toc240227076"/>
       <w:r>
         <w:rPr>
           <w:rFonts w:cs="Times New Roman"/>
@@ -6041,23 +6891,14 @@
           <w:rFonts w:cs="Times New Roman"/>
         </w:rPr>
       </w:pPr>
-      <w:bookmarkStart w:id="12" w:name="_Toc240112300"/>
-      <w:r>
-        <w:rPr>
-          <w:rFonts w:cs="Times New Roman"/>
-        </w:rPr>
-        <w:lastRenderedPageBreak/>
+      <w:bookmarkStart w:id="12" w:name="_Toc240227077"/>
+      <w:r>
+        <w:rPr>
+          <w:rFonts w:cs="Times New Roman"/>
+        </w:rPr>
         <w:t>3.2 Code</w:t>
       </w:r>
       <w:bookmarkEnd w:id="12"/>
-    </w:p>
-    <w:p>
-      <w:pPr>
-        <w:spacing w:line="360" w:lineRule="auto"/>
-        <w:rPr>
-          <w:rFonts w:cs="Times New Roman"/>
-        </w:rPr>
-      </w:pPr>
     </w:p>
     <w:tbl>
       <w:tblPr>
@@ -6253,7 +7094,7 @@
           <w:rFonts w:cs="Times New Roman"/>
         </w:rPr>
       </w:pPr>
-      <w:bookmarkStart w:id="13" w:name="_Toc240112301"/>
+      <w:bookmarkStart w:id="13" w:name="_Toc240227078"/>
       <w:r>
         <w:rPr>
           <w:rFonts w:cs="Times New Roman"/>
@@ -6280,7 +7121,9 @@
       <w:r>
         <w:rPr>
           <w:rFonts w:cs="Times New Roman"/>
-        </w:rPr>
+          <w:noProof/>
+        </w:rPr>
+        <w:lastRenderedPageBreak/>
         <w:drawing>
           <wp:inline distT="0" distB="0" distL="0" distR="0" wp14:anchorId="72D56C6E" wp14:editId="00ADB000">
             <wp:extent cx="3115110" cy="3162741"/>
@@ -6334,7 +7177,7 @@
           <w:rFonts w:cs="Times New Roman"/>
         </w:rPr>
       </w:pPr>
-      <w:bookmarkStart w:id="14" w:name="_Toc240112302"/>
+      <w:bookmarkStart w:id="14" w:name="_Toc240227079"/>
       <w:r>
         <w:rPr>
           <w:rFonts w:cs="Times New Roman"/>
@@ -6427,12 +7270,11 @@
           <w:rFonts w:cs="Times New Roman"/>
         </w:rPr>
       </w:pPr>
-      <w:bookmarkStart w:id="15" w:name="_Toc240112303"/>
-      <w:r>
-        <w:rPr>
-          <w:rFonts w:cs="Times New Roman"/>
-        </w:rPr>
-        <w:lastRenderedPageBreak/>
+      <w:bookmarkStart w:id="15" w:name="_Toc240227080"/>
+      <w:r>
+        <w:rPr>
+          <w:rFonts w:cs="Times New Roman"/>
+        </w:rPr>
         <w:t>BÀI 4: SLICING VÀ INDEXING</w:t>
       </w:r>
       <w:bookmarkEnd w:id="15"/>
@@ -6445,7 +7287,7 @@
           <w:rFonts w:cs="Times New Roman"/>
         </w:rPr>
       </w:pPr>
-      <w:bookmarkStart w:id="16" w:name="_Toc240112304"/>
+      <w:bookmarkStart w:id="16" w:name="_Toc240227081"/>
       <w:r>
         <w:rPr>
           <w:rFonts w:cs="Times New Roman"/>
@@ -6476,7 +7318,7 @@
           <w:rFonts w:cs="Times New Roman"/>
         </w:rPr>
       </w:pPr>
-      <w:bookmarkStart w:id="17" w:name="_Toc240112305"/>
+      <w:bookmarkStart w:id="17" w:name="_Toc240227082"/>
       <w:r>
         <w:rPr>
           <w:rFonts w:cs="Times New Roman"/>
@@ -6833,35 +7675,36 @@
           <w:rFonts w:cs="Times New Roman"/>
         </w:rPr>
       </w:pPr>
-      <w:bookmarkStart w:id="18" w:name="_Toc240112306"/>
-      <w:r>
-        <w:rPr>
-          <w:rFonts w:cs="Times New Roman"/>
+      <w:bookmarkStart w:id="18" w:name="_Toc240227083"/>
+      <w:r>
+        <w:rPr>
+          <w:rFonts w:cs="Times New Roman"/>
+        </w:rPr>
+        <w:t>4.3 Kết quả chạy</w:t>
+      </w:r>
+      <w:bookmarkEnd w:id="18"/>
+    </w:p>
+    <w:p>
+      <w:pPr>
+        <w:spacing w:line="360" w:lineRule="auto"/>
+        <w:rPr>
+          <w:rFonts w:cs="Times New Roman"/>
+        </w:rPr>
+      </w:pPr>
+    </w:p>
+    <w:p>
+      <w:pPr>
+        <w:spacing w:line="360" w:lineRule="auto"/>
+        <w:rPr>
+          <w:rFonts w:cs="Times New Roman"/>
+        </w:rPr>
+      </w:pPr>
+      <w:r>
+        <w:rPr>
+          <w:rFonts w:cs="Times New Roman"/>
+          <w:noProof/>
         </w:rPr>
         <w:lastRenderedPageBreak/>
-        <w:t>4.3 Kết quả chạy</w:t>
-      </w:r>
-      <w:bookmarkEnd w:id="18"/>
-    </w:p>
-    <w:p>
-      <w:pPr>
-        <w:spacing w:line="360" w:lineRule="auto"/>
-        <w:rPr>
-          <w:rFonts w:cs="Times New Roman"/>
-        </w:rPr>
-      </w:pPr>
-    </w:p>
-    <w:p>
-      <w:pPr>
-        <w:spacing w:line="360" w:lineRule="auto"/>
-        <w:rPr>
-          <w:rFonts w:cs="Times New Roman"/>
-        </w:rPr>
-      </w:pPr>
-      <w:r>
-        <w:rPr>
-          <w:rFonts w:cs="Times New Roman"/>
-        </w:rPr>
         <w:drawing>
           <wp:inline distT="0" distB="0" distL="0" distR="0" wp14:anchorId="75E94DBF" wp14:editId="759EAD52">
             <wp:extent cx="3372630" cy="4280403"/>
@@ -6918,6 +7761,7 @@
       <w:r>
         <w:rPr>
           <w:rFonts w:cs="Times New Roman"/>
+          <w:noProof/>
         </w:rPr>
         <w:drawing>
           <wp:inline distT="0" distB="0" distL="0" distR="0" wp14:anchorId="153832BF" wp14:editId="2C64FB81">
@@ -6964,7 +7808,7 @@
           <w:rFonts w:cs="Times New Roman"/>
         </w:rPr>
       </w:pPr>
-      <w:bookmarkStart w:id="19" w:name="_Toc240112307"/>
+      <w:bookmarkStart w:id="19" w:name="_Toc240227084"/>
       <w:r>
         <w:rPr>
           <w:rFonts w:cs="Times New Roman"/>
@@ -7097,60 +7941,60 @@
           <w:rFonts w:cs="Times New Roman"/>
         </w:rPr>
       </w:pPr>
-      <w:bookmarkStart w:id="20" w:name="_Toc240112308"/>
+      <w:bookmarkStart w:id="20" w:name="_Toc240227085"/>
+      <w:r>
+        <w:rPr>
+          <w:rFonts w:cs="Times New Roman"/>
+        </w:rPr>
+        <w:t>BÀI 5: RESHAPE VÀ FLATTEN</w:t>
+      </w:r>
+      <w:bookmarkEnd w:id="20"/>
+    </w:p>
+    <w:p>
+      <w:pPr>
+        <w:pStyle w:val="Heading2"/>
+        <w:spacing w:line="360" w:lineRule="auto"/>
+        <w:rPr>
+          <w:rFonts w:cs="Times New Roman"/>
+        </w:rPr>
+      </w:pPr>
+      <w:bookmarkStart w:id="21" w:name="_Toc240227086"/>
+      <w:r>
+        <w:rPr>
+          <w:rFonts w:cs="Times New Roman"/>
+        </w:rPr>
+        <w:t>5.1 Nội dung</w:t>
+      </w:r>
+      <w:bookmarkEnd w:id="21"/>
+    </w:p>
+    <w:p>
+      <w:pPr>
+        <w:spacing w:line="360" w:lineRule="auto"/>
+        <w:rPr>
+          <w:rFonts w:cs="Times New Roman"/>
+        </w:rPr>
+      </w:pPr>
+      <w:r>
+        <w:rPr>
+          <w:rFonts w:cs="Times New Roman"/>
+        </w:rPr>
+        <w:t>Thực hiện flatten và reshape tensor, đồng thời kiểm tra số lượng phần tử trước và sau khi thay đổi hình dạng.</w:t>
+      </w:r>
+    </w:p>
+    <w:p>
+      <w:pPr>
+        <w:pStyle w:val="Heading2"/>
+        <w:spacing w:line="360" w:lineRule="auto"/>
+        <w:rPr>
+          <w:rFonts w:cs="Times New Roman"/>
+        </w:rPr>
+      </w:pPr>
+      <w:bookmarkStart w:id="22" w:name="_Toc240227087"/>
       <w:r>
         <w:rPr>
           <w:rFonts w:cs="Times New Roman"/>
         </w:rPr>
         <w:lastRenderedPageBreak/>
-        <w:t>BÀI 5: RESHAPE VÀ FLATTEN</w:t>
-      </w:r>
-      <w:bookmarkEnd w:id="20"/>
-    </w:p>
-    <w:p>
-      <w:pPr>
-        <w:pStyle w:val="Heading2"/>
-        <w:spacing w:line="360" w:lineRule="auto"/>
-        <w:rPr>
-          <w:rFonts w:cs="Times New Roman"/>
-        </w:rPr>
-      </w:pPr>
-      <w:bookmarkStart w:id="21" w:name="_Toc240112309"/>
-      <w:r>
-        <w:rPr>
-          <w:rFonts w:cs="Times New Roman"/>
-        </w:rPr>
-        <w:t>5.1 Nội dung</w:t>
-      </w:r>
-      <w:bookmarkEnd w:id="21"/>
-    </w:p>
-    <w:p>
-      <w:pPr>
-        <w:spacing w:line="360" w:lineRule="auto"/>
-        <w:rPr>
-          <w:rFonts w:cs="Times New Roman"/>
-        </w:rPr>
-      </w:pPr>
-      <w:r>
-        <w:rPr>
-          <w:rFonts w:cs="Times New Roman"/>
-        </w:rPr>
-        <w:t>Thực hiện flatten và reshape tensor, đồng thời kiểm tra số lượng phần tử trước và sau khi thay đổi hình dạng.</w:t>
-      </w:r>
-    </w:p>
-    <w:p>
-      <w:pPr>
-        <w:pStyle w:val="Heading2"/>
-        <w:spacing w:line="360" w:lineRule="auto"/>
-        <w:rPr>
-          <w:rFonts w:cs="Times New Roman"/>
-        </w:rPr>
-      </w:pPr>
-      <w:bookmarkStart w:id="22" w:name="_Toc240112310"/>
-      <w:r>
-        <w:rPr>
-          <w:rFonts w:cs="Times New Roman"/>
-        </w:rPr>
         <w:t>5.2 Code</w:t>
       </w:r>
       <w:bookmarkEnd w:id="22"/>
@@ -7513,7 +8357,7 @@
       <w:pPr>
         <w:pStyle w:val="Heading2"/>
       </w:pPr>
-      <w:bookmarkStart w:id="23" w:name="_Toc240112311"/>
+      <w:bookmarkStart w:id="23" w:name="_Toc240227088"/>
       <w:r>
         <w:lastRenderedPageBreak/>
         <w:t>5.3 Kết quả chạy</w:t>
@@ -7530,6 +8374,7 @@
       <w:r>
         <w:rPr>
           <w:rFonts w:cs="Times New Roman"/>
+          <w:noProof/>
         </w:rPr>
         <w:drawing>
           <wp:inline distT="0" distB="0" distL="0" distR="0" wp14:anchorId="0965DE5D" wp14:editId="05B88BC6">
@@ -7578,6 +8423,7 @@
       <w:r>
         <w:rPr>
           <w:rFonts w:cs="Times New Roman"/>
+          <w:noProof/>
         </w:rPr>
         <w:drawing>
           <wp:inline distT="0" distB="0" distL="0" distR="0" wp14:anchorId="6AFBB2C2" wp14:editId="5505B868">
@@ -7640,7 +8486,7 @@
           <w:rFonts w:cs="Times New Roman"/>
         </w:rPr>
       </w:pPr>
-      <w:bookmarkStart w:id="24" w:name="_Toc240112312"/>
+      <w:bookmarkStart w:id="24" w:name="_Toc240227089"/>
       <w:r>
         <w:rPr>
           <w:rFonts w:cs="Times New Roman"/>
@@ -7713,7 +8559,7 @@
           <w:rFonts w:cs="Times New Roman"/>
         </w:rPr>
       </w:pPr>
-      <w:bookmarkStart w:id="25" w:name="_Toc240112313"/>
+      <w:bookmarkStart w:id="25" w:name="_Toc240227090"/>
       <w:r>
         <w:rPr>
           <w:rFonts w:cs="Times New Roman"/>
@@ -7730,7 +8576,7 @@
           <w:rFonts w:cs="Times New Roman"/>
         </w:rPr>
       </w:pPr>
-      <w:bookmarkStart w:id="26" w:name="_Toc240112314"/>
+      <w:bookmarkStart w:id="26" w:name="_Toc240227091"/>
       <w:r>
         <w:rPr>
           <w:rFonts w:cs="Times New Roman"/>
@@ -7775,7 +8621,7 @@
           <w:rFonts w:cs="Times New Roman"/>
         </w:rPr>
       </w:pPr>
-      <w:bookmarkStart w:id="27" w:name="_Toc240112315"/>
+      <w:bookmarkStart w:id="27" w:name="_Toc240227092"/>
       <w:r>
         <w:rPr>
           <w:rFonts w:cs="Times New Roman"/>
@@ -8205,7 +9051,7 @@
           <w:rFonts w:cs="Times New Roman"/>
         </w:rPr>
       </w:pPr>
-      <w:bookmarkStart w:id="28" w:name="_Toc240112316"/>
+      <w:bookmarkStart w:id="28" w:name="_Toc240227093"/>
       <w:r>
         <w:rPr>
           <w:rFonts w:cs="Times New Roman"/>
@@ -8225,6 +9071,7 @@
       <w:r>
         <w:rPr>
           <w:rFonts w:cs="Times New Roman"/>
+          <w:noProof/>
         </w:rPr>
         <w:drawing>
           <wp:inline distT="0" distB="0" distL="0" distR="0" wp14:anchorId="137BAAE7" wp14:editId="12DAAE14">
@@ -8271,7 +9118,7 @@
           <w:rFonts w:cs="Times New Roman"/>
         </w:rPr>
       </w:pPr>
-      <w:bookmarkStart w:id="29" w:name="_Toc240112317"/>
+      <w:bookmarkStart w:id="29" w:name="_Toc240227094"/>
       <w:r>
         <w:rPr>
           <w:rFonts w:cs="Times New Roman"/>
@@ -8359,7 +9206,7 @@
           <w:rFonts w:cs="Times New Roman"/>
         </w:rPr>
       </w:pPr>
-      <w:bookmarkStart w:id="30" w:name="_Toc240112318"/>
+      <w:bookmarkStart w:id="30" w:name="_Toc240227095"/>
       <w:r>
         <w:rPr>
           <w:rFonts w:cs="Times New Roman"/>
@@ -8376,7 +9223,7 @@
           <w:rFonts w:cs="Times New Roman"/>
         </w:rPr>
       </w:pPr>
-      <w:bookmarkStart w:id="31" w:name="_Toc240112319"/>
+      <w:bookmarkStart w:id="31" w:name="_Toc240227096"/>
       <w:r>
         <w:rPr>
           <w:rFonts w:cs="Times New Roman"/>
@@ -8407,7 +9254,7 @@
           <w:rFonts w:cs="Times New Roman"/>
         </w:rPr>
       </w:pPr>
-      <w:bookmarkStart w:id="32" w:name="_Toc240112320"/>
+      <w:bookmarkStart w:id="32" w:name="_Toc240227097"/>
       <w:r>
         <w:rPr>
           <w:rFonts w:cs="Times New Roman"/>
@@ -8808,7 +9655,7 @@
           <w:rFonts w:cs="Times New Roman"/>
         </w:rPr>
       </w:pPr>
-      <w:bookmarkStart w:id="33" w:name="_Toc240112321"/>
+      <w:bookmarkStart w:id="33" w:name="_Toc240227098"/>
       <w:r>
         <w:rPr>
           <w:rFonts w:cs="Times New Roman"/>
@@ -8828,6 +9675,7 @@
       <w:r>
         <w:rPr>
           <w:rFonts w:cs="Times New Roman"/>
+          <w:noProof/>
         </w:rPr>
         <w:drawing>
           <wp:inline distT="0" distB="0" distL="0" distR="0" wp14:anchorId="068263EA" wp14:editId="533FCAFE">
@@ -8882,7 +9730,7 @@
           <w:rFonts w:cs="Times New Roman"/>
         </w:rPr>
       </w:pPr>
-      <w:bookmarkStart w:id="34" w:name="_Toc240112322"/>
+      <w:bookmarkStart w:id="34" w:name="_Toc240227099"/>
       <w:r>
         <w:rPr>
           <w:rFonts w:cs="Times New Roman"/>
@@ -8941,7 +9789,7 @@
           <w:rFonts w:cs="Times New Roman"/>
         </w:rPr>
       </w:pPr>
-      <w:bookmarkStart w:id="35" w:name="_Toc240112323"/>
+      <w:bookmarkStart w:id="35" w:name="_Toc240227100"/>
       <w:r>
         <w:rPr>
           <w:rFonts w:cs="Times New Roman"/>
@@ -8959,7 +9807,7 @@
           <w:rFonts w:cs="Times New Roman"/>
         </w:rPr>
       </w:pPr>
-      <w:bookmarkStart w:id="36" w:name="_Toc240112324"/>
+      <w:bookmarkStart w:id="36" w:name="_Toc240227101"/>
       <w:r>
         <w:rPr>
           <w:rFonts w:cs="Times New Roman"/>
@@ -8990,7 +9838,7 @@
           <w:rFonts w:cs="Times New Roman"/>
         </w:rPr>
       </w:pPr>
-      <w:bookmarkStart w:id="37" w:name="_Toc240112325"/>
+      <w:bookmarkStart w:id="37" w:name="_Toc240227102"/>
       <w:r>
         <w:rPr>
           <w:rFonts w:cs="Times New Roman"/>
@@ -9213,7 +10061,7 @@
           <w:rFonts w:cs="Times New Roman"/>
         </w:rPr>
       </w:pPr>
-      <w:bookmarkStart w:id="38" w:name="_Toc240112326"/>
+      <w:bookmarkStart w:id="38" w:name="_Toc240227103"/>
       <w:r>
         <w:rPr>
           <w:rFonts w:cs="Times New Roman"/>
@@ -9232,6 +10080,7 @@
       <w:r>
         <w:rPr>
           <w:rFonts w:cs="Times New Roman"/>
+          <w:noProof/>
         </w:rPr>
         <w:drawing>
           <wp:inline distT="0" distB="0" distL="0" distR="0" wp14:anchorId="5A3C9403" wp14:editId="61071E90">
@@ -9278,7 +10127,7 @@
           <w:rFonts w:cs="Times New Roman"/>
         </w:rPr>
       </w:pPr>
-      <w:bookmarkStart w:id="39" w:name="_Toc240112327"/>
+      <w:bookmarkStart w:id="39" w:name="_Toc240227104"/>
       <w:r>
         <w:rPr>
           <w:rFonts w:cs="Times New Roman"/>
@@ -9297,6 +10146,7 @@
       <w:r>
         <w:rPr>
           <w:rFonts w:cs="Times New Roman"/>
+          <w:noProof/>
         </w:rPr>
         <w:drawing>
           <wp:inline distT="0" distB="0" distL="0" distR="0" wp14:anchorId="5FF9CE40" wp14:editId="0D6A4897">
@@ -9343,7 +10193,7 @@
           <w:rFonts w:cs="Times New Roman"/>
         </w:rPr>
       </w:pPr>
-      <w:bookmarkStart w:id="40" w:name="_Toc240112328"/>
+      <w:bookmarkStart w:id="40" w:name="_Toc240227105"/>
       <w:r>
         <w:rPr>
           <w:rFonts w:cs="Times New Roman"/>
@@ -9567,7 +10417,7 @@
           <w:rFonts w:cs="Times New Roman"/>
         </w:rPr>
       </w:pPr>
-      <w:bookmarkStart w:id="41" w:name="_Toc240112329"/>
+      <w:bookmarkStart w:id="41" w:name="_Toc240227106"/>
       <w:r>
         <w:rPr>
           <w:rFonts w:cs="Times New Roman"/>
@@ -9586,6 +10436,7 @@
       <w:r>
         <w:rPr>
           <w:rFonts w:cs="Times New Roman"/>
+          <w:noProof/>
         </w:rPr>
         <w:drawing>
           <wp:inline distT="0" distB="0" distL="0" distR="0" wp14:anchorId="07E27DF3" wp14:editId="17069212">
@@ -9640,7 +10491,7 @@
           <w:rFonts w:cs="Times New Roman"/>
         </w:rPr>
       </w:pPr>
-      <w:bookmarkStart w:id="42" w:name="_Toc240112330"/>
+      <w:bookmarkStart w:id="42" w:name="_Toc240227107"/>
       <w:r>
         <w:rPr>
           <w:rFonts w:cs="Times New Roman"/>
@@ -9674,26 +10525,14 @@
         <w:rPr>
           <w:rFonts w:cs="Times New Roman"/>
         </w:rPr>
-        <w:t xml:space="preserve">Với lần code đầu tiên, hàm </w:t>
-      </w:r>
-      <w:r>
-        <w:rPr>
-          <w:rFonts w:cs="Times New Roman"/>
-        </w:rPr>
-        <w:t>y=x</w:t>
+        <w:t>Với lần code đầu tiên, hàm y=x</w:t>
       </w:r>
       <w:proofErr w:type="gramStart"/>
       <w:r>
         <w:rPr>
           <w:rFonts w:cs="Times New Roman"/>
         </w:rPr>
-        <w:t>²</w:t>
-      </w:r>
-      <w:r>
-        <w:rPr>
-          <w:rFonts w:cs="Times New Roman"/>
-        </w:rPr>
-        <w:t xml:space="preserve"> ,</w:t>
+        <w:t>² ,</w:t>
       </w:r>
       <w:proofErr w:type="gramEnd"/>
       <w:r>
@@ -9714,19 +10553,7 @@
         <w:rPr>
           <w:rFonts w:cs="Times New Roman"/>
         </w:rPr>
-        <w:t xml:space="preserve">Khi thay hàm thành </w:t>
-      </w:r>
-      <w:r>
-        <w:rPr>
-          <w:rFonts w:cs="Times New Roman"/>
-        </w:rPr>
-        <w:t>y=3x²+2x+1</w:t>
-      </w:r>
-      <w:r>
-        <w:rPr>
-          <w:rFonts w:cs="Times New Roman"/>
-        </w:rPr>
-        <w:t xml:space="preserve">, đạo hàm tại x=3,6 là 23.6, trùng với kết quả </w:t>
+        <w:t xml:space="preserve">Khi thay hàm thành y=3x²+2x+1, đạo hàm tại x=3,6 là 23.6, trùng với kết quả </w:t>
       </w:r>
       <w:proofErr w:type="gramStart"/>
       <w:r>
@@ -9748,7 +10575,7 @@
         <w:pStyle w:val="Heading1"/>
         <w:spacing w:line="360" w:lineRule="auto"/>
       </w:pPr>
-      <w:bookmarkStart w:id="43" w:name="_Toc240112331"/>
+      <w:bookmarkStart w:id="43" w:name="_Toc240227108"/>
       <w:r>
         <w:t>BÀI 9: GRADIENT DESCENT TÌM HỆ SỐ ĐA THỨC</w:t>
       </w:r>
@@ -9759,7 +10586,7 @@
         <w:pStyle w:val="Heading2"/>
         <w:spacing w:line="360" w:lineRule="auto"/>
       </w:pPr>
-      <w:bookmarkStart w:id="44" w:name="_Toc240112332"/>
+      <w:bookmarkStart w:id="44" w:name="_Toc240227109"/>
       <w:r>
         <w:t>9.1 Nội dung</w:t>
       </w:r>
@@ -9790,7 +10617,7 @@
         <w:pStyle w:val="Heading2"/>
         <w:spacing w:line="360" w:lineRule="auto"/>
       </w:pPr>
-      <w:bookmarkStart w:id="45" w:name="_Toc240112333"/>
+      <w:bookmarkStart w:id="45" w:name="_Toc240227110"/>
       <w:r>
         <w:lastRenderedPageBreak/>
         <w:t>9.2 Code</w:t>
@@ -10189,7 +11016,7 @@
         <w:pStyle w:val="Heading2"/>
         <w:spacing w:line="360" w:lineRule="auto"/>
       </w:pPr>
-      <w:bookmarkStart w:id="46" w:name="_Toc240112334"/>
+      <w:bookmarkStart w:id="46" w:name="_Toc240227111"/>
       <w:r>
         <w:t>9.3 Kết quả chạy</w:t>
       </w:r>
@@ -10200,6 +11027,9 @@
         <w:spacing w:line="360" w:lineRule="auto"/>
       </w:pPr>
       <w:r>
+        <w:rPr>
+          <w:noProof/>
+        </w:rPr>
         <w:drawing>
           <wp:inline distT="0" distB="0" distL="0" distR="0" wp14:anchorId="4573A0B5" wp14:editId="7FE92A86">
             <wp:extent cx="4210638" cy="2610214"/>
@@ -10247,7 +11077,7 @@
         <w:pStyle w:val="Heading2"/>
         <w:spacing w:line="360" w:lineRule="auto"/>
       </w:pPr>
-      <w:bookmarkStart w:id="47" w:name="_Toc240112335"/>
+      <w:bookmarkStart w:id="47" w:name="_Toc240227112"/>
       <w:r>
         <w:t>9.4 Cell kiểm tra</w:t>
       </w:r>
@@ -10359,7 +11189,7 @@
         <w:pStyle w:val="Heading2"/>
         <w:spacing w:line="360" w:lineRule="auto"/>
       </w:pPr>
-      <w:bookmarkStart w:id="48" w:name="_Toc240112336"/>
+      <w:bookmarkStart w:id="48" w:name="_Toc240227113"/>
       <w:r>
         <w:lastRenderedPageBreak/>
         <w:t>9.5 Kết quả kiểm tra</w:t>
@@ -10371,6 +11201,9 @@
         <w:spacing w:line="360" w:lineRule="auto"/>
       </w:pPr>
       <w:r>
+        <w:rPr>
+          <w:noProof/>
+        </w:rPr>
         <w:drawing>
           <wp:inline distT="0" distB="0" distL="0" distR="0" wp14:anchorId="1DEBCF01" wp14:editId="7A711A2C">
             <wp:extent cx="1971950" cy="2343477"/>
@@ -10418,7 +11251,7 @@
         <w:pStyle w:val="Heading2"/>
         <w:spacing w:line="360" w:lineRule="auto"/>
       </w:pPr>
-      <w:bookmarkStart w:id="49" w:name="_Toc240112337"/>
+      <w:bookmarkStart w:id="49" w:name="_Toc240227114"/>
       <w:r>
         <w:t>9.6 Nhận xét</w:t>
       </w:r>
@@ -10429,27 +11262,15 @@
         <w:spacing w:line="360" w:lineRule="auto"/>
       </w:pPr>
       <w:r>
-        <w:t xml:space="preserve">Bài toán sử dụng dữ liệu được sinh từ đa thức </w:t>
-      </w:r>
-      <w:r>
-        <w:t>y=x²+2x+3</w:t>
-      </w:r>
-      <w:r>
-        <w:t>, do đó có 3 hệ số mong đợi lần lượt là [1,2,3]</w:t>
-      </w:r>
-    </w:p>
-    <w:p>
-      <w:pPr>
-        <w:spacing w:line="360" w:lineRule="auto"/>
-      </w:pPr>
-      <w:r>
-        <w:t xml:space="preserve">Sau quá trình huấn luyện Nadam và Autograd, tìm được các hệ số xấp xỉ </w:t>
-      </w:r>
-      <w:r>
-        <w:t>[1.0017, 2.0026, 2.6859]</w:t>
-      </w:r>
-      <w:r>
-        <w:t>, hai hệ số đầu rất gần với giá trị mong đợi, trong khi hệ số tự do còn sai lệch so với 3.</w:t>
+        <w:t>Bài toán sử dụng dữ liệu được sinh từ đa thức y=x²+2x+3, do đó có 3 hệ số mong đợi lần lượt là [1,2,3]</w:t>
+      </w:r>
+    </w:p>
+    <w:p>
+      <w:pPr>
+        <w:spacing w:line="360" w:lineRule="auto"/>
+      </w:pPr>
+      <w:r>
+        <w:t>Sau quá trình huấn luyện Nadam và Autograd, tìm được các hệ số xấp xỉ [1.0017, 2.0026, 2.6859], hai hệ số đầu rất gần với giá trị mong đợi, trong khi hệ số tự do còn sai lệch so với 3.</w:t>
       </w:r>
     </w:p>
     <w:p>
@@ -10473,7 +11294,7 @@
         <w:pStyle w:val="Heading1"/>
         <w:spacing w:line="360" w:lineRule="auto"/>
       </w:pPr>
-      <w:bookmarkStart w:id="50" w:name="_Toc240112338"/>
+      <w:bookmarkStart w:id="50" w:name="_Toc240227115"/>
       <w:r>
         <w:t>BÀI 10: GIẢI HỆ PHƯƠNG TRÌNH BẰNG AUTOGRAND</w:t>
       </w:r>
@@ -10488,7 +11309,10 @@
         </w:numPr>
         <w:spacing w:line="360" w:lineRule="auto"/>
       </w:pPr>
-      <w:bookmarkStart w:id="51" w:name="_Toc240112339"/>
+      <w:r>
+        <w:t xml:space="preserve"> </w:t>
+      </w:r>
+      <w:bookmarkStart w:id="51" w:name="_Toc240227116"/>
       <w:r>
         <w:t>Nội dung</w:t>
       </w:r>
@@ -10519,7 +11343,10 @@
         </w:numPr>
         <w:spacing w:line="360" w:lineRule="auto"/>
       </w:pPr>
-      <w:bookmarkStart w:id="52" w:name="_Toc240112340"/>
+      <w:r>
+        <w:t xml:space="preserve"> </w:t>
+      </w:r>
+      <w:bookmarkStart w:id="52" w:name="_Toc240227117"/>
       <w:r>
         <w:t>Code</w:t>
       </w:r>
@@ -10840,7 +11667,10 @@
         </w:numPr>
         <w:spacing w:line="360" w:lineRule="auto"/>
       </w:pPr>
-      <w:bookmarkStart w:id="53" w:name="_Toc240112341"/>
+      <w:r>
+        <w:t xml:space="preserve"> </w:t>
+      </w:r>
+      <w:bookmarkStart w:id="53" w:name="_Toc240227118"/>
       <w:r>
         <w:t>Cell kiểm tra</w:t>
       </w:r>
@@ -10948,9 +11778,12 @@
         </w:numPr>
         <w:spacing w:line="360" w:lineRule="auto"/>
       </w:pPr>
-      <w:bookmarkStart w:id="54" w:name="_Toc240112342"/>
       <w:r>
         <w:lastRenderedPageBreak/>
+        <w:t xml:space="preserve"> </w:t>
+      </w:r>
+      <w:bookmarkStart w:id="54" w:name="_Toc240227119"/>
+      <w:r>
         <w:t>Kết quả chạy</w:t>
       </w:r>
       <w:bookmarkEnd w:id="54"/>
@@ -10960,6 +11793,9 @@
         <w:spacing w:line="360" w:lineRule="auto"/>
       </w:pPr>
       <w:r>
+        <w:rPr>
+          <w:noProof/>
+        </w:rPr>
         <w:drawing>
           <wp:inline distT="0" distB="0" distL="0" distR="0" wp14:anchorId="5480E479" wp14:editId="6FC9D51D">
             <wp:extent cx="4277322" cy="1314633"/>
@@ -11010,6 +11846,9 @@
         <w:spacing w:line="360" w:lineRule="auto"/>
       </w:pPr>
       <w:r>
+        <w:rPr>
+          <w:noProof/>
+        </w:rPr>
         <w:drawing>
           <wp:inline distT="0" distB="0" distL="0" distR="0" wp14:anchorId="72D49608" wp14:editId="608CAB43">
             <wp:extent cx="3334215" cy="1286054"/>
@@ -11061,7 +11900,10 @@
         </w:numPr>
         <w:spacing w:line="360" w:lineRule="auto"/>
       </w:pPr>
-      <w:bookmarkStart w:id="55" w:name="_Toc240112343"/>
+      <w:r>
+        <w:t xml:space="preserve"> </w:t>
+      </w:r>
+      <w:bookmarkStart w:id="55" w:name="_Toc240227120"/>
       <w:r>
         <w:t>Nhận xét</w:t>
       </w:r>
@@ -11093,11 +11935,1205 @@
     </w:p>
     <w:p>
       <w:pPr>
-        <w:spacing w:line="360" w:lineRule="auto"/>
-      </w:pPr>
-    </w:p>
+        <w:pStyle w:val="Heading1"/>
+      </w:pPr>
+      <w:r>
+        <w:tab/>
+      </w:r>
+      <w:bookmarkStart w:id="56" w:name="_Toc240227121"/>
+      <w:r>
+        <w:t>BÀI 11: CHƯƠNG TRÌNH PYTORCH TỔNG HỢP</w:t>
+      </w:r>
+      <w:bookmarkEnd w:id="56"/>
+    </w:p>
+    <w:p>
+      <w:pPr>
+        <w:pStyle w:val="Heading2"/>
+      </w:pPr>
+      <w:bookmarkStart w:id="57" w:name="_Toc240227122"/>
+      <w:r>
+        <w:t>11.1 Nội dung 1</w:t>
+      </w:r>
+      <w:bookmarkEnd w:id="57"/>
+    </w:p>
+    <w:p>
+      <w:r>
+        <w:t>Tạo tensor có 24 phần tử và reshape thành 4x6, 2x12, 2x3x4.</w:t>
+      </w:r>
+    </w:p>
+    <w:p>
+      <w:pPr>
+        <w:pStyle w:val="Heading2"/>
+      </w:pPr>
+      <w:bookmarkStart w:id="58" w:name="_Toc240227123"/>
+      <w:r>
+        <w:t>11.2 Code</w:t>
+      </w:r>
+      <w:bookmarkEnd w:id="58"/>
+    </w:p>
+    <w:tbl>
+      <w:tblPr>
+        <w:tblStyle w:val="TableGrid"/>
+        <w:tblW w:w="0" w:type="auto"/>
+        <w:tblLook w:val="04A0" w:firstRow="1" w:lastRow="0" w:firstColumn="1" w:lastColumn="0" w:noHBand="0" w:noVBand="1"/>
+      </w:tblPr>
+      <w:tblGrid>
+        <w:gridCol w:w="10457"/>
+      </w:tblGrid>
+      <w:tr>
+        <w:tc>
+          <w:tcPr>
+            <w:tcW w:w="10457" w:type="dxa"/>
+            <w:shd w:val="clear" w:color="auto" w:fill="D9D9D9" w:themeFill="background1" w:themeFillShade="D9"/>
+          </w:tcPr>
+          <w:p>
+            <w:r>
+              <w:t xml:space="preserve">X= </w:t>
+            </w:r>
+            <w:proofErr w:type="gramStart"/>
+            <w:r>
+              <w:t>torch.arange</w:t>
+            </w:r>
+            <w:proofErr w:type="gramEnd"/>
+            <w:r>
+              <w:t>(24)</w:t>
+            </w:r>
+          </w:p>
+          <w:p>
+            <w:proofErr w:type="gramStart"/>
+            <w:r>
+              <w:t>print(</w:t>
+            </w:r>
+            <w:proofErr w:type="gramEnd"/>
+            <w:r>
+              <w:t>"X: ")</w:t>
+            </w:r>
+          </w:p>
+          <w:p>
+            <w:r>
+              <w:t>print(X)</w:t>
+            </w:r>
+          </w:p>
+          <w:p/>
+          <w:p>
+            <w:proofErr w:type="gramStart"/>
+            <w:r>
+              <w:t>print(</w:t>
+            </w:r>
+            <w:proofErr w:type="gramEnd"/>
+            <w:r>
+              <w:t>"\nReshape 4x6 :\n", X.reshape(4,6))</w:t>
+            </w:r>
+          </w:p>
+          <w:p>
+            <w:proofErr w:type="gramStart"/>
+            <w:r>
+              <w:t>print(</w:t>
+            </w:r>
+            <w:proofErr w:type="gramEnd"/>
+            <w:r>
+              <w:t>"\nReshape 2x12 :\n", X.reshape(2,12))</w:t>
+            </w:r>
+          </w:p>
+          <w:p>
+            <w:proofErr w:type="gramStart"/>
+            <w:r>
+              <w:t>print(</w:t>
+            </w:r>
+            <w:proofErr w:type="gramEnd"/>
+            <w:r>
+              <w:t>"\nReshape 2x3x4:\n ", X.reshape(2, 3, 4) )</w:t>
+            </w:r>
+          </w:p>
+          <w:p/>
+        </w:tc>
+      </w:tr>
+    </w:tbl>
+    <w:p/>
+    <w:p>
+      <w:pPr>
+        <w:pStyle w:val="Heading2"/>
+      </w:pPr>
+      <w:bookmarkStart w:id="59" w:name="_Toc240227124"/>
+      <w:r>
+        <w:lastRenderedPageBreak/>
+        <w:t>11.3 Kết quả chạy</w:t>
+      </w:r>
+      <w:bookmarkEnd w:id="59"/>
+    </w:p>
+    <w:p>
+      <w:r>
+        <w:drawing>
+          <wp:inline distT="0" distB="0" distL="0" distR="0" wp14:anchorId="6DCCB156" wp14:editId="6995B7DD">
+            <wp:extent cx="6646545" cy="4455795"/>
+            <wp:effectExtent l="0" t="0" r="1905" b="1905"/>
+            <wp:docPr id="22" name="Picture 22"/>
+            <wp:cNvGraphicFramePr>
+              <a:graphicFrameLocks xmlns:a="http://schemas.openxmlformats.org/drawingml/2006/main" noChangeAspect="1"/>
+            </wp:cNvGraphicFramePr>
+            <a:graphic xmlns:a="http://schemas.openxmlformats.org/drawingml/2006/main">
+              <a:graphicData uri="http://schemas.openxmlformats.org/drawingml/2006/picture">
+                <pic:pic xmlns:pic="http://schemas.openxmlformats.org/drawingml/2006/picture">
+                  <pic:nvPicPr>
+                    <pic:cNvPr id="1" name=""/>
+                    <pic:cNvPicPr/>
+                  </pic:nvPicPr>
+                  <pic:blipFill>
+                    <a:blip r:embed="rId27"/>
+                    <a:stretch>
+                      <a:fillRect/>
+                    </a:stretch>
+                  </pic:blipFill>
+                  <pic:spPr>
+                    <a:xfrm>
+                      <a:off x="0" y="0"/>
+                      <a:ext cx="6646545" cy="4455795"/>
+                    </a:xfrm>
+                    <a:prstGeom prst="rect">
+                      <a:avLst/>
+                    </a:prstGeom>
+                  </pic:spPr>
+                </pic:pic>
+              </a:graphicData>
+            </a:graphic>
+          </wp:inline>
+        </w:drawing>
+      </w:r>
+    </w:p>
+    <w:p/>
+    <w:p/>
+    <w:p/>
+    <w:p>
+      <w:pPr>
+        <w:pStyle w:val="Heading2"/>
+      </w:pPr>
+      <w:bookmarkStart w:id="60" w:name="_Toc240227125"/>
+      <w:r>
+        <w:t>11.</w:t>
+      </w:r>
+      <w:r>
+        <w:t>4</w:t>
+      </w:r>
+      <w:r>
+        <w:t xml:space="preserve"> Nội dung 2</w:t>
+      </w:r>
+      <w:bookmarkEnd w:id="60"/>
+    </w:p>
+    <w:p>
+      <w:r>
+        <w:t>Tạo 2 tensor A và B có kích thước 3x4, tính A+B, A*B, A/B, trung bình theo cột, độ lệch chuẩn theo cột.</w:t>
+      </w:r>
+    </w:p>
+    <w:p>
+      <w:pPr>
+        <w:pStyle w:val="Heading2"/>
+      </w:pPr>
+      <w:bookmarkStart w:id="61" w:name="_Toc240227126"/>
+      <w:r>
+        <w:t>11.</w:t>
+      </w:r>
+      <w:r>
+        <w:t>5</w:t>
+      </w:r>
+      <w:r>
+        <w:t xml:space="preserve"> Code</w:t>
+      </w:r>
+      <w:bookmarkEnd w:id="61"/>
+    </w:p>
+    <w:tbl>
+      <w:tblPr>
+        <w:tblStyle w:val="TableGrid"/>
+        <w:tblW w:w="0" w:type="auto"/>
+        <w:tblLook w:val="04A0" w:firstRow="1" w:lastRow="0" w:firstColumn="1" w:lastColumn="0" w:noHBand="0" w:noVBand="1"/>
+      </w:tblPr>
+      <w:tblGrid>
+        <w:gridCol w:w="10457"/>
+      </w:tblGrid>
+      <w:tr>
+        <w:tc>
+          <w:tcPr>
+            <w:tcW w:w="10457" w:type="dxa"/>
+            <w:shd w:val="clear" w:color="auto" w:fill="D9D9D9" w:themeFill="background1" w:themeFillShade="D9"/>
+          </w:tcPr>
+          <w:p>
+            <w:r>
+              <w:t xml:space="preserve">A= </w:t>
+            </w:r>
+            <w:proofErr w:type="gramStart"/>
+            <w:r>
+              <w:t>torch.randn</w:t>
+            </w:r>
+            <w:proofErr w:type="gramEnd"/>
+            <w:r>
+              <w:t>(3,4)</w:t>
+            </w:r>
+          </w:p>
+          <w:p>
+            <w:r>
+              <w:t xml:space="preserve">B= </w:t>
+            </w:r>
+            <w:proofErr w:type="gramStart"/>
+            <w:r>
+              <w:t>torch.randn</w:t>
+            </w:r>
+            <w:proofErr w:type="gramEnd"/>
+            <w:r>
+              <w:t>(3,4)</w:t>
+            </w:r>
+          </w:p>
+          <w:p/>
+          <w:p>
+            <w:proofErr w:type="gramStart"/>
+            <w:r>
+              <w:t>print(</w:t>
+            </w:r>
+            <w:proofErr w:type="gramEnd"/>
+            <w:r>
+              <w:t>"A: ")</w:t>
+            </w:r>
+          </w:p>
+          <w:p>
+            <w:r>
+              <w:t>print(A)</w:t>
+            </w:r>
+          </w:p>
+          <w:p>
+            <w:proofErr w:type="gramStart"/>
+            <w:r>
+              <w:t>print(</w:t>
+            </w:r>
+            <w:proofErr w:type="gramEnd"/>
+            <w:r>
+              <w:t>"\nB: ")</w:t>
+            </w:r>
+          </w:p>
+          <w:p>
+            <w:r>
+              <w:t>print(B)</w:t>
+            </w:r>
+          </w:p>
+          <w:p/>
+          <w:p>
+            <w:proofErr w:type="gramStart"/>
+            <w:r>
+              <w:t>print(</w:t>
+            </w:r>
+            <w:proofErr w:type="gramEnd"/>
+            <w:r>
+              <w:t>"\nA + B:\n ", (A + B))</w:t>
+            </w:r>
+          </w:p>
+          <w:p>
+            <w:proofErr w:type="gramStart"/>
+            <w:r>
+              <w:t>print(</w:t>
+            </w:r>
+            <w:proofErr w:type="gramEnd"/>
+            <w:r>
+              <w:t>"\nA * B:\n ", (A * B))</w:t>
+            </w:r>
+          </w:p>
+          <w:p>
+            <w:proofErr w:type="gramStart"/>
+            <w:r>
+              <w:t>print(</w:t>
+            </w:r>
+            <w:proofErr w:type="gramEnd"/>
+            <w:r>
+              <w:t>"\nA / B:\n ", (A / B))</w:t>
+            </w:r>
+          </w:p>
+          <w:p/>
+          <w:p>
+            <w:proofErr w:type="gramStart"/>
+            <w:r>
+              <w:t>print(</w:t>
+            </w:r>
+            <w:proofErr w:type="gramEnd"/>
+            <w:r>
+              <w:t>"\nTrung binh theo cot: ")</w:t>
+            </w:r>
+          </w:p>
+          <w:p>
+            <w:proofErr w:type="gramStart"/>
+            <w:r>
+              <w:t>print(</w:t>
+            </w:r>
+            <w:proofErr w:type="gramEnd"/>
+            <w:r>
+              <w:t>torch.mean(A, dim=0))</w:t>
+            </w:r>
+          </w:p>
+          <w:p/>
+          <w:p>
+            <w:proofErr w:type="gramStart"/>
+            <w:r>
+              <w:t>print(</w:t>
+            </w:r>
+            <w:proofErr w:type="gramEnd"/>
+            <w:r>
+              <w:t>"\nDo lech chuan theo cot: ")</w:t>
+            </w:r>
+          </w:p>
+          <w:p>
+            <w:proofErr w:type="gramStart"/>
+            <w:r>
+              <w:t>print(</w:t>
+            </w:r>
+            <w:proofErr w:type="gramEnd"/>
+            <w:r>
+              <w:t>torch.std(A, dim=0))</w:t>
+            </w:r>
+          </w:p>
+        </w:tc>
+      </w:tr>
+    </w:tbl>
+    <w:p/>
+    <w:p>
+      <w:pPr>
+        <w:pStyle w:val="Heading2"/>
+      </w:pPr>
+      <w:bookmarkStart w:id="62" w:name="_Toc240227127"/>
+      <w:r>
+        <w:t>11.6 Kết quả chạy</w:t>
+      </w:r>
+      <w:bookmarkEnd w:id="62"/>
+    </w:p>
+    <w:p>
+      <w:r>
+        <w:drawing>
+          <wp:inline distT="0" distB="0" distL="0" distR="0" wp14:anchorId="307AE968" wp14:editId="3C3C1B00">
+            <wp:extent cx="6646545" cy="6210300"/>
+            <wp:effectExtent l="0" t="0" r="1905" b="0"/>
+            <wp:docPr id="21" name="Picture 21"/>
+            <wp:cNvGraphicFramePr>
+              <a:graphicFrameLocks xmlns:a="http://schemas.openxmlformats.org/drawingml/2006/main" noChangeAspect="1"/>
+            </wp:cNvGraphicFramePr>
+            <a:graphic xmlns:a="http://schemas.openxmlformats.org/drawingml/2006/main">
+              <a:graphicData uri="http://schemas.openxmlformats.org/drawingml/2006/picture">
+                <pic:pic xmlns:pic="http://schemas.openxmlformats.org/drawingml/2006/picture">
+                  <pic:nvPicPr>
+                    <pic:cNvPr id="1" name=""/>
+                    <pic:cNvPicPr/>
+                  </pic:nvPicPr>
+                  <pic:blipFill>
+                    <a:blip r:embed="rId28"/>
+                    <a:stretch>
+                      <a:fillRect/>
+                    </a:stretch>
+                  </pic:blipFill>
+                  <pic:spPr>
+                    <a:xfrm>
+                      <a:off x="0" y="0"/>
+                      <a:ext cx="6646545" cy="6210300"/>
+                    </a:xfrm>
+                    <a:prstGeom prst="rect">
+                      <a:avLst/>
+                    </a:prstGeom>
+                  </pic:spPr>
+                </pic:pic>
+              </a:graphicData>
+            </a:graphic>
+          </wp:inline>
+        </w:drawing>
+      </w:r>
+    </w:p>
+    <w:p/>
+    <w:p>
+      <w:pPr>
+        <w:pStyle w:val="Heading2"/>
+      </w:pPr>
+      <w:bookmarkStart w:id="63" w:name="_Toc240227128"/>
+      <w:r>
+        <w:t>11.7 Nội dung 3</w:t>
+      </w:r>
+      <w:bookmarkEnd w:id="63"/>
+    </w:p>
+    <w:p>
+      <w:pPr>
+        <w:rPr>
+          <w:rStyle w:val="mord"/>
+        </w:rPr>
+      </w:pPr>
+      <w:r>
+        <w:t xml:space="preserve">Cho đa thức </w:t>
+      </w:r>
+      <w:r>
+        <w:rPr>
+          <w:rStyle w:val="mord"/>
+        </w:rPr>
+        <w:t>y</w:t>
+      </w:r>
+      <w:r>
+        <w:rPr>
+          <w:rStyle w:val="mrel"/>
+        </w:rPr>
+        <w:t>=</w:t>
+      </w:r>
+      <w:r>
+        <w:rPr>
+          <w:rStyle w:val="mord"/>
+        </w:rPr>
+        <w:t>2x2</w:t>
+      </w:r>
+      <w:r>
+        <w:rPr>
+          <w:rStyle w:val="mbin"/>
+        </w:rPr>
+        <w:t>+</w:t>
+      </w:r>
+      <w:r>
+        <w:rPr>
+          <w:rStyle w:val="mord"/>
+        </w:rPr>
+        <w:t>5x</w:t>
+      </w:r>
+      <w:r>
+        <w:rPr>
+          <w:rStyle w:val="mbin"/>
+        </w:rPr>
+        <w:t>+</w:t>
+      </w:r>
+      <w:r>
+        <w:rPr>
+          <w:rStyle w:val="mord"/>
+        </w:rPr>
+        <w:t>3</w:t>
+      </w:r>
+      <w:r>
+        <w:rPr>
+          <w:rStyle w:val="mord"/>
+        </w:rPr>
+        <w:t>, dùng autogrand tại x=2 và kiểm tra thủ công.</w:t>
+      </w:r>
+    </w:p>
+    <w:p>
+      <w:pPr>
+        <w:pStyle w:val="Heading2"/>
+      </w:pPr>
+      <w:bookmarkStart w:id="64" w:name="_Toc240227129"/>
+      <w:r>
+        <w:t>11.8 Code</w:t>
+      </w:r>
+      <w:bookmarkEnd w:id="64"/>
+    </w:p>
+    <w:tbl>
+      <w:tblPr>
+        <w:tblStyle w:val="TableGrid"/>
+        <w:tblW w:w="0" w:type="auto"/>
+        <w:tblLook w:val="04A0" w:firstRow="1" w:lastRow="0" w:firstColumn="1" w:lastColumn="0" w:noHBand="0" w:noVBand="1"/>
+      </w:tblPr>
+      <w:tblGrid>
+        <w:gridCol w:w="10457"/>
+      </w:tblGrid>
+      <w:tr>
+        <w:tc>
+          <w:tcPr>
+            <w:tcW w:w="10457" w:type="dxa"/>
+            <w:shd w:val="clear" w:color="auto" w:fill="D9D9D9" w:themeFill="background1" w:themeFillShade="D9"/>
+          </w:tcPr>
+          <w:p>
+            <w:r>
+              <w:t xml:space="preserve">x= </w:t>
+            </w:r>
+            <w:proofErr w:type="gramStart"/>
+            <w:r>
+              <w:t>torch.tensor</w:t>
+            </w:r>
+            <w:proofErr w:type="gramEnd"/>
+            <w:r>
+              <w:t>(2.0, requires_grad=True)</w:t>
+            </w:r>
+          </w:p>
+          <w:p/>
+          <w:p>
+            <w:r>
+              <w:t>y= 2* x**2 + 5 * x + 3</w:t>
+            </w:r>
+          </w:p>
+          <w:p>
+            <w:proofErr w:type="gramStart"/>
+            <w:r>
+              <w:t>y.backward</w:t>
+            </w:r>
+            <w:proofErr w:type="gramEnd"/>
+            <w:r>
+              <w:t>()</w:t>
+            </w:r>
+          </w:p>
+          <w:p/>
+          <w:p>
+            <w:proofErr w:type="gramStart"/>
+            <w:r>
+              <w:t>print(</w:t>
+            </w:r>
+            <w:proofErr w:type="gramEnd"/>
+            <w:r>
+              <w:t>"x= ", x.item())</w:t>
+            </w:r>
+          </w:p>
+          <w:p>
+            <w:proofErr w:type="gramStart"/>
+            <w:r>
+              <w:t>print(</w:t>
+            </w:r>
+            <w:proofErr w:type="gramEnd"/>
+            <w:r>
+              <w:t>"y= ", y.item())</w:t>
+            </w:r>
+          </w:p>
+          <w:p>
+            <w:proofErr w:type="gramStart"/>
+            <w:r>
+              <w:t>print(</w:t>
+            </w:r>
+            <w:proofErr w:type="gramEnd"/>
+            <w:r>
+              <w:t>"y'= ", x.grad.item())</w:t>
+            </w:r>
+          </w:p>
+        </w:tc>
+      </w:tr>
+    </w:tbl>
+    <w:p/>
+    <w:p>
+      <w:r>
+        <w:t>Kiểm tra bằng thủ công: y= 2x² + 5x + 3 tại x= 2</w:t>
+      </w:r>
+    </w:p>
+    <w:p>
+      <w:r>
+        <w:t>- y'= 4x + 5</w:t>
+      </w:r>
+    </w:p>
+    <w:p>
+      <w:r>
+        <w:t>- tại x=2 thì y'= 4</w:t>
+      </w:r>
+      <w:r>
+        <w:t>x</w:t>
+      </w:r>
+      <w:r>
+        <w:t>2 +5 = 13</w:t>
+      </w:r>
+    </w:p>
+    <w:p/>
+    <w:p>
+      <w:pPr>
+        <w:pStyle w:val="Heading2"/>
+      </w:pPr>
+      <w:bookmarkStart w:id="65" w:name="_Toc240227130"/>
+      <w:r>
+        <w:t>11.9 Kết quả chạy</w:t>
+      </w:r>
+      <w:bookmarkEnd w:id="65"/>
+    </w:p>
+    <w:p/>
+    <w:p>
+      <w:r>
+        <w:drawing>
+          <wp:inline distT="0" distB="0" distL="0" distR="0" wp14:anchorId="29C05223" wp14:editId="521BC46F">
+            <wp:extent cx="1505160" cy="1009791"/>
+            <wp:effectExtent l="0" t="0" r="0" b="0"/>
+            <wp:docPr id="16" name="Picture 16"/>
+            <wp:cNvGraphicFramePr>
+              <a:graphicFrameLocks xmlns:a="http://schemas.openxmlformats.org/drawingml/2006/main" noChangeAspect="1"/>
+            </wp:cNvGraphicFramePr>
+            <a:graphic xmlns:a="http://schemas.openxmlformats.org/drawingml/2006/main">
+              <a:graphicData uri="http://schemas.openxmlformats.org/drawingml/2006/picture">
+                <pic:pic xmlns:pic="http://schemas.openxmlformats.org/drawingml/2006/picture">
+                  <pic:nvPicPr>
+                    <pic:cNvPr id="1" name=""/>
+                    <pic:cNvPicPr/>
+                  </pic:nvPicPr>
+                  <pic:blipFill>
+                    <a:blip r:embed="rId29"/>
+                    <a:stretch>
+                      <a:fillRect/>
+                    </a:stretch>
+                  </pic:blipFill>
+                  <pic:spPr>
+                    <a:xfrm>
+                      <a:off x="0" y="0"/>
+                      <a:ext cx="1505160" cy="1009791"/>
+                    </a:xfrm>
+                    <a:prstGeom prst="rect">
+                      <a:avLst/>
+                    </a:prstGeom>
+                  </pic:spPr>
+                </pic:pic>
+              </a:graphicData>
+            </a:graphic>
+          </wp:inline>
+        </w:drawing>
+      </w:r>
+    </w:p>
+    <w:p>
+      <w:pPr>
+        <w:pStyle w:val="Heading2"/>
+      </w:pPr>
+      <w:bookmarkStart w:id="66" w:name="_Toc240227131"/>
+      <w:r>
+        <w:t>11.10 Nội dung 4</w:t>
+      </w:r>
+      <w:bookmarkEnd w:id="66"/>
+    </w:p>
+    <w:p>
+      <w:pPr>
+        <w:rPr>
+          <w:rStyle w:val="mord"/>
+        </w:rPr>
+      </w:pPr>
+      <w:r>
+        <w:t xml:space="preserve">Thay đa thức trong bài 9 thành: </w:t>
+      </w:r>
+      <w:r>
+        <w:rPr>
+          <w:rStyle w:val="mord"/>
+        </w:rPr>
+        <w:t>y</w:t>
+      </w:r>
+      <w:r>
+        <w:rPr>
+          <w:rStyle w:val="mrel"/>
+        </w:rPr>
+        <w:t>=</w:t>
+      </w:r>
+      <w:r>
+        <w:rPr>
+          <w:rStyle w:val="mord"/>
+        </w:rPr>
+        <w:t>2x2</w:t>
+      </w:r>
+      <w:r>
+        <w:rPr>
+          <w:rStyle w:val="mbin"/>
+        </w:rPr>
+        <w:t>−</w:t>
+      </w:r>
+      <w:r>
+        <w:rPr>
+          <w:rStyle w:val="mord"/>
+        </w:rPr>
+        <w:t>3x</w:t>
+      </w:r>
+      <w:r>
+        <w:rPr>
+          <w:rStyle w:val="mbin"/>
+        </w:rPr>
+        <w:t>+</w:t>
+      </w:r>
+      <w:proofErr w:type="gramStart"/>
+      <w:r>
+        <w:rPr>
+          <w:rStyle w:val="mord"/>
+        </w:rPr>
+        <w:t>5</w:t>
+      </w:r>
+      <w:r>
+        <w:rPr>
+          <w:rStyle w:val="mord"/>
+        </w:rPr>
+        <w:t xml:space="preserve"> ,</w:t>
+      </w:r>
+      <w:proofErr w:type="gramEnd"/>
+      <w:r>
+        <w:rPr>
+          <w:rStyle w:val="mord"/>
+        </w:rPr>
+        <w:t xml:space="preserve"> sau đó huấn luyện và cho biết các hệ số tìm được.</w:t>
+      </w:r>
+    </w:p>
+    <w:p>
+      <w:pPr>
+        <w:rPr>
+          <w:rStyle w:val="mord"/>
+        </w:rPr>
+      </w:pPr>
+    </w:p>
+    <w:p>
+      <w:pPr>
+        <w:pStyle w:val="Heading2"/>
+      </w:pPr>
+      <w:bookmarkStart w:id="67" w:name="_Toc240227132"/>
+      <w:r>
+        <w:t>11.11 Code</w:t>
+      </w:r>
+      <w:bookmarkEnd w:id="67"/>
+    </w:p>
+    <w:tbl>
+      <w:tblPr>
+        <w:tblStyle w:val="TableGrid"/>
+        <w:tblW w:w="0" w:type="auto"/>
+        <w:tblLook w:val="04A0" w:firstRow="1" w:lastRow="0" w:firstColumn="1" w:lastColumn="0" w:noHBand="0" w:noVBand="1"/>
+      </w:tblPr>
+      <w:tblGrid>
+        <w:gridCol w:w="10457"/>
+      </w:tblGrid>
+      <w:tr>
+        <w:tc>
+          <w:tcPr>
+            <w:tcW w:w="10457" w:type="dxa"/>
+            <w:shd w:val="clear" w:color="auto" w:fill="D9D9D9" w:themeFill="background1" w:themeFillShade="D9"/>
+          </w:tcPr>
+          <w:p>
+            <w:r>
+              <w:t xml:space="preserve">polynomial = </w:t>
+            </w:r>
+            <w:proofErr w:type="gramStart"/>
+            <w:r>
+              <w:t>np.poly</w:t>
+            </w:r>
+            <w:proofErr w:type="gramEnd"/>
+            <w:r>
+              <w:t>1d([2, -3, 5])</w:t>
+            </w:r>
+          </w:p>
+          <w:p>
+            <w:r>
+              <w:t>N=20</w:t>
+            </w:r>
+          </w:p>
+          <w:p/>
+          <w:p>
+            <w:r>
+              <w:t># Sinh dữ liệu</w:t>
+            </w:r>
+          </w:p>
+          <w:p>
+            <w:r>
+              <w:t xml:space="preserve">X= </w:t>
+            </w:r>
+            <w:proofErr w:type="gramStart"/>
+            <w:r>
+              <w:t>np.random</w:t>
+            </w:r>
+            <w:proofErr w:type="gramEnd"/>
+            <w:r>
+              <w:t>.randn(N,1)*5</w:t>
+            </w:r>
+          </w:p>
+          <w:p/>
+          <w:p>
+            <w:r>
+              <w:t># tính y</w:t>
+            </w:r>
+          </w:p>
+          <w:p>
+            <w:r>
+              <w:t>Y=polynomial(X)</w:t>
+            </w:r>
+          </w:p>
+          <w:p/>
+          <w:p>
+            <w:r>
+              <w:t xml:space="preserve"># tạo ma trận </w:t>
+            </w:r>
+          </w:p>
+          <w:p>
+            <w:r>
+              <w:t xml:space="preserve">XX= </w:t>
+            </w:r>
+            <w:proofErr w:type="gramStart"/>
+            <w:r>
+              <w:t>np.hstack</w:t>
+            </w:r>
+            <w:proofErr w:type="gramEnd"/>
+            <w:r>
+              <w:t>([</w:t>
+            </w:r>
+          </w:p>
+          <w:p>
+            <w:r>
+              <w:t>    X * X,</w:t>
+            </w:r>
+          </w:p>
+          <w:p>
+            <w:r>
+              <w:t>    X,</w:t>
+            </w:r>
+          </w:p>
+          <w:p>
+            <w:r>
+              <w:t xml:space="preserve">    </w:t>
+            </w:r>
+            <w:proofErr w:type="gramStart"/>
+            <w:r>
+              <w:t>np.ones</w:t>
+            </w:r>
+            <w:proofErr w:type="gramEnd"/>
+            <w:r>
+              <w:t>_like(X)</w:t>
+            </w:r>
+          </w:p>
+          <w:p>
+            <w:r>
+              <w:t>])</w:t>
+            </w:r>
+          </w:p>
+          <w:p/>
+          <w:p>
+            <w:r>
+              <w:t># Khởi tạo 3 hệ số</w:t>
+            </w:r>
+          </w:p>
+          <w:p>
+            <w:r>
+              <w:t xml:space="preserve">ư= </w:t>
+            </w:r>
+            <w:proofErr w:type="gramStart"/>
+            <w:r>
+              <w:t>torch.randn</w:t>
+            </w:r>
+            <w:proofErr w:type="gramEnd"/>
+            <w:r>
+              <w:t>(</w:t>
+            </w:r>
+          </w:p>
+          <w:p>
+            <w:r>
+              <w:t>    3,1,</w:t>
+            </w:r>
+          </w:p>
+          <w:p>
+            <w:r>
+              <w:t>    requires_grad=True</w:t>
+            </w:r>
+          </w:p>
+          <w:p>
+            <w:r>
+              <w:t>)</w:t>
+            </w:r>
+          </w:p>
+          <w:p/>
+          <w:p>
+            <w:r>
+              <w:t># chuyển sang tensor</w:t>
+            </w:r>
+          </w:p>
+          <w:p>
+            <w:r>
+              <w:lastRenderedPageBreak/>
+              <w:t xml:space="preserve">x_train= </w:t>
+            </w:r>
+            <w:proofErr w:type="gramStart"/>
+            <w:r>
+              <w:t>torch.tensor</w:t>
+            </w:r>
+            <w:proofErr w:type="gramEnd"/>
+            <w:r>
+              <w:t>(</w:t>
+            </w:r>
+          </w:p>
+          <w:p>
+            <w:r>
+              <w:t>    XX,</w:t>
+            </w:r>
+          </w:p>
+          <w:p>
+            <w:r>
+              <w:t>    dtype=</w:t>
+            </w:r>
+            <w:proofErr w:type="gramStart"/>
+            <w:r>
+              <w:t>torch.float</w:t>
+            </w:r>
+            <w:proofErr w:type="gramEnd"/>
+            <w:r>
+              <w:t>32</w:t>
+            </w:r>
+          </w:p>
+          <w:p>
+            <w:r>
+              <w:t>)</w:t>
+            </w:r>
+          </w:p>
+          <w:p/>
+          <w:p>
+            <w:r>
+              <w:t xml:space="preserve">y_train= </w:t>
+            </w:r>
+            <w:proofErr w:type="gramStart"/>
+            <w:r>
+              <w:t>torch.tensor</w:t>
+            </w:r>
+            <w:proofErr w:type="gramEnd"/>
+            <w:r>
+              <w:t>(</w:t>
+            </w:r>
+          </w:p>
+          <w:p>
+            <w:r>
+              <w:t>    Y,</w:t>
+            </w:r>
+          </w:p>
+          <w:p>
+            <w:r>
+              <w:t>    dtype=</w:t>
+            </w:r>
+            <w:proofErr w:type="gramStart"/>
+            <w:r>
+              <w:t>torch.float</w:t>
+            </w:r>
+            <w:proofErr w:type="gramEnd"/>
+            <w:r>
+              <w:t>32</w:t>
+            </w:r>
+          </w:p>
+          <w:p>
+            <w:r>
+              <w:t>)</w:t>
+            </w:r>
+          </w:p>
+          <w:p/>
+          <w:p>
+            <w:r>
+              <w:t># NAdam</w:t>
+            </w:r>
+          </w:p>
+          <w:p>
+            <w:r>
+              <w:t xml:space="preserve">optimizer = </w:t>
+            </w:r>
+            <w:proofErr w:type="gramStart"/>
+            <w:r>
+              <w:t>torch.optim</w:t>
+            </w:r>
+            <w:proofErr w:type="gramEnd"/>
+            <w:r>
+              <w:t>.NAdam(</w:t>
+            </w:r>
+          </w:p>
+          <w:p>
+            <w:r>
+              <w:t>    [w],</w:t>
+            </w:r>
+          </w:p>
+          <w:p>
+            <w:r>
+              <w:t>    lr=0.01</w:t>
+            </w:r>
+          </w:p>
+          <w:p>
+            <w:r>
+              <w:t>)</w:t>
+            </w:r>
+          </w:p>
+          <w:p/>
+          <w:p>
+            <w:proofErr w:type="gramStart"/>
+            <w:r>
+              <w:t>print(</w:t>
+            </w:r>
+            <w:proofErr w:type="gramEnd"/>
+            <w:r>
+              <w:t>"he so ban dau: ")</w:t>
+            </w:r>
+          </w:p>
+          <w:p>
+            <w:r>
+              <w:t>print(w)</w:t>
+            </w:r>
+          </w:p>
+          <w:p/>
+          <w:p>
+            <w:r>
+              <w:t xml:space="preserve"># </w:t>
+            </w:r>
+            <w:proofErr w:type="gramStart"/>
+            <w:r>
+              <w:t>huan</w:t>
+            </w:r>
+            <w:proofErr w:type="gramEnd"/>
+            <w:r>
+              <w:t xml:space="preserve"> luyen</w:t>
+            </w:r>
+          </w:p>
+          <w:p>
+            <w:r>
+              <w:t xml:space="preserve">for epoch in </w:t>
+            </w:r>
+            <w:proofErr w:type="gramStart"/>
+            <w:r>
+              <w:t>range(</w:t>
+            </w:r>
+            <w:proofErr w:type="gramEnd"/>
+            <w:r>
+              <w:t>1000):</w:t>
+            </w:r>
+          </w:p>
+          <w:p>
+            <w:r>
+              <w:t xml:space="preserve">    </w:t>
+            </w:r>
+            <w:proofErr w:type="gramStart"/>
+            <w:r>
+              <w:t>optimizer.zero</w:t>
+            </w:r>
+            <w:proofErr w:type="gramEnd"/>
+            <w:r>
+              <w:t>_grad()</w:t>
+            </w:r>
+          </w:p>
+          <w:p>
+            <w:r>
+              <w:t>    y_pred= x_train @ w</w:t>
+            </w:r>
+          </w:p>
+          <w:p>
+            <w:r>
+              <w:t xml:space="preserve">    mse = </w:t>
+            </w:r>
+            <w:proofErr w:type="gramStart"/>
+            <w:r>
+              <w:t>torch.mean</w:t>
+            </w:r>
+            <w:proofErr w:type="gramEnd"/>
+            <w:r>
+              <w:t>(</w:t>
+            </w:r>
+          </w:p>
+          <w:p>
+            <w:r>
+              <w:t xml:space="preserve">        </w:t>
+            </w:r>
+            <w:proofErr w:type="gramStart"/>
+            <w:r>
+              <w:t>torch.square</w:t>
+            </w:r>
+            <w:proofErr w:type="gramEnd"/>
+            <w:r>
+              <w:t>(y_train - y_pred)</w:t>
+            </w:r>
+          </w:p>
+          <w:p>
+            <w:r>
+              <w:t>    )</w:t>
+            </w:r>
+          </w:p>
+          <w:p>
+            <w:r>
+              <w:t xml:space="preserve">    </w:t>
+            </w:r>
+            <w:proofErr w:type="gramStart"/>
+            <w:r>
+              <w:t>mse.backward</w:t>
+            </w:r>
+            <w:proofErr w:type="gramEnd"/>
+            <w:r>
+              <w:t>()</w:t>
+            </w:r>
+          </w:p>
+          <w:p>
+            <w:r>
+              <w:t xml:space="preserve">    </w:t>
+            </w:r>
+            <w:proofErr w:type="gramStart"/>
+            <w:r>
+              <w:t>optimizer.step</w:t>
+            </w:r>
+            <w:proofErr w:type="gramEnd"/>
+            <w:r>
+              <w:t>()</w:t>
+            </w:r>
+          </w:p>
+          <w:p/>
+          <w:p>
+            <w:proofErr w:type="gramStart"/>
+            <w:r>
+              <w:t>print(</w:t>
+            </w:r>
+            <w:proofErr w:type="gramEnd"/>
+            <w:r>
+              <w:t>"\nHe so hoc duoc: ")</w:t>
+            </w:r>
+          </w:p>
+          <w:p>
+            <w:r>
+              <w:t>print(w)</w:t>
+            </w:r>
+          </w:p>
+          <w:p/>
+          <w:p>
+            <w:proofErr w:type="gramStart"/>
+            <w:r>
+              <w:t>print(</w:t>
+            </w:r>
+            <w:proofErr w:type="gramEnd"/>
+            <w:r>
+              <w:t>"\nHe so mong muon: ")</w:t>
+            </w:r>
+          </w:p>
+          <w:p>
+            <w:proofErr w:type="gramStart"/>
+            <w:r>
+              <w:t>print(</w:t>
+            </w:r>
+            <w:proofErr w:type="gramEnd"/>
+            <w:r>
+              <w:t>"[2, -3, 5]")</w:t>
+            </w:r>
+          </w:p>
+          <w:p/>
+        </w:tc>
+      </w:tr>
+    </w:tbl>
+    <w:p/>
+    <w:p>
+      <w:pPr>
+        <w:pStyle w:val="Heading2"/>
+      </w:pPr>
+      <w:bookmarkStart w:id="68" w:name="_Toc240227133"/>
+      <w:r>
+        <w:lastRenderedPageBreak/>
+        <w:t>11.12 kết quả chạy</w:t>
+      </w:r>
+      <w:bookmarkEnd w:id="68"/>
+    </w:p>
+    <w:p>
+      <w:r>
+        <w:drawing>
+          <wp:inline distT="0" distB="0" distL="0" distR="0" wp14:anchorId="78EC89BD" wp14:editId="256D03DC">
+            <wp:extent cx="4172532" cy="2943636"/>
+            <wp:effectExtent l="0" t="0" r="0" b="9525"/>
+            <wp:docPr id="7" name="Picture 7"/>
+            <wp:cNvGraphicFramePr>
+              <a:graphicFrameLocks xmlns:a="http://schemas.openxmlformats.org/drawingml/2006/main" noChangeAspect="1"/>
+            </wp:cNvGraphicFramePr>
+            <a:graphic xmlns:a="http://schemas.openxmlformats.org/drawingml/2006/main">
+              <a:graphicData uri="http://schemas.openxmlformats.org/drawingml/2006/picture">
+                <pic:pic xmlns:pic="http://schemas.openxmlformats.org/drawingml/2006/picture">
+                  <pic:nvPicPr>
+                    <pic:cNvPr id="1" name=""/>
+                    <pic:cNvPicPr/>
+                  </pic:nvPicPr>
+                  <pic:blipFill>
+                    <a:blip r:embed="rId30"/>
+                    <a:stretch>
+                      <a:fillRect/>
+                    </a:stretch>
+                  </pic:blipFill>
+                  <pic:spPr>
+                    <a:xfrm>
+                      <a:off x="0" y="0"/>
+                      <a:ext cx="4172532" cy="2943636"/>
+                    </a:xfrm>
+                    <a:prstGeom prst="rect">
+                      <a:avLst/>
+                    </a:prstGeom>
+                  </pic:spPr>
+                </pic:pic>
+              </a:graphicData>
+            </a:graphic>
+          </wp:inline>
+        </w:drawing>
+      </w:r>
+    </w:p>
+    <w:p/>
+    <w:p/>
+    <w:p/>
     <w:sectPr>
-      <w:footerReference w:type="default" r:id="rId27"/>
+      <w:footerReference w:type="default" r:id="rId31"/>
       <w:pgSz w:w="11907" w:h="16840" w:code="9"/>
       <w:pgMar w:top="720" w:right="720" w:bottom="720" w:left="720" w:header="720" w:footer="720" w:gutter="0"/>
       <w:cols w:space="720"/>
@@ -11961,7 +13997,7 @@
   <w:style w:type="paragraph" w:default="1" w:styleId="Normal">
     <w:name w:val="Normal"/>
     <w:qFormat/>
-    <w:rsid w:val="002811E5"/>
+    <w:rsid w:val="00CA10B2"/>
     <w:pPr>
       <w:jc w:val="both"/>
     </w:pPr>
@@ -12017,6 +14053,7 @@
   <w:style w:type="character" w:default="1" w:styleId="DefaultParagraphFont">
     <w:name w:val="Default Paragraph Font"/>
     <w:uiPriority w:val="1"/>
+    <w:semiHidden/>
     <w:unhideWhenUsed/>
   </w:style>
   <w:style w:type="table" w:default="1" w:styleId="TableNormal">

</xml_diff>